<commit_message>
Log 21:17 fix-verification result: order-correction question re-run, card clean
Same question as 21:03, card again matches text (И-12-10-03), no Находка 2 here. Document-relevance question (заказ покупателя vs заказ на производство) still open.

Co-Authored-By: Claude Sonnet 5 <noreply@anthropic.com>
Claude-Session: https://claude.ai/code/session_01DpSN8JwCJ3tg3JVUadr2zE
</commit_message>
<xml_diff>
--- a/docs/accounts/eco/pilot-test-04-fix-verification.docx
+++ b/docs/accounts/eco/pilot-test-04-fix-verification.docx
@@ -1402,6 +1402,83 @@
           </w:p>
         </w:tc>
       </w:tr>
+      <w:tr>
+        <w:tc>
+          <w:tcPr>
+            <w:tcW w:type="dxa" w:w="1728"/>
+          </w:tcPr>
+          <w:p>
+            <w:r>
+              <w:t>21:17</w:t>
+            </w:r>
+          </w:p>
+        </w:tc>
+        <w:tc>
+          <w:tcPr>
+            <w:tcW w:type="dxa" w:w="1728"/>
+          </w:tcPr>
+          <w:p>
+            <w:r>
+              <w:t>Тот же вопрос про корректировку Заказа на производство, что в 21:03 — повтор</w:t>
+            </w:r>
+          </w:p>
+        </w:tc>
+        <w:tc>
+          <w:tcPr>
+            <w:tcW w:type="dxa" w:w="1728"/>
+          </w:tcPr>
+          <w:p>
+            <w:r>
+              <w:t>Агент/скоуп не видны на скриншоте</w:t>
+            </w:r>
+          </w:p>
+        </w:tc>
+        <w:tc>
+          <w:tcPr>
+            <w:tcW w:type="dxa" w:w="1728"/>
+          </w:tcPr>
+          <w:p>
+            <w:r>
+              <w:t xml:space="preserve">Ответ детальнее, чем в 21:03, с прямой цитатой: «Откройте Заказ покупателя», создайте корректировку, укажите количество со знаком «−» (разница между заказанным и фактически выпущенным весом); если уже создан Заказ на производство — обратиться к ОБ. Источник в тексте — </w:t>
+            </w:r>
+            <w:r>
+              <w:rPr>
+                <w:b/>
+              </w:rPr>
+              <w:t>И-12-10-03</w:t>
+            </w:r>
+            <w:r>
+              <w:t xml:space="preserve"> «Корректировка Заказу покупателя в 1С», с цитатой из документа. Карточка: </w:t>
+            </w:r>
+            <w:r>
+              <w:rPr>
+                <w:rFonts w:ascii="Consolas" w:hAnsi="Consolas"/>
+                <w:sz w:val="20"/>
+              </w:rPr>
+              <w:t>для теста ИИ (1)/И-12-10-03 Корректировка Заказу покупателя в 1С.docx</w:t>
+            </w:r>
+            <w:r>
+              <w:t xml:space="preserve">, 62% — </w:t>
+            </w:r>
+            <w:r>
+              <w:rPr>
+                <w:b/>
+              </w:rPr>
+              <w:t>совпадает с текстом, Находка 2 не проявилась</w:t>
+            </w:r>
+          </w:p>
+        </w:tc>
+        <w:tc>
+          <w:tcPr>
+            <w:tcW w:type="dxa" w:w="1728"/>
+          </w:tcPr>
+          <w:p>
+            <w:r>
+              <w:t>Стабильно чисто по карточке (как и в 21:03), но открытым остаётся тот же вопрос релевантности: ответ описывает «Заказ покупателя», а вопрос — про «Заказ на производство» (ожидался Д-08-04-01 по Находке 3); возможно, это два разных процесса, которые платформа не различает</w:t>
+            </w:r>
+          </w:p>
+        </w:tc>
+      </w:tr>
     </w:tbl>
     <w:p>
       <w:pPr>
@@ -2115,6 +2192,58 @@
           </w:p>
         </w:tc>
       </w:tr>
+      <w:tr>
+        <w:tc>
+          <w:tcPr>
+            <w:tcW w:type="dxa" w:w="1728"/>
+          </w:tcPr>
+          <w:p>
+            <w:r>
+              <w:t>12</w:t>
+            </w:r>
+          </w:p>
+        </w:tc>
+        <w:tc>
+          <w:tcPr>
+            <w:tcW w:type="dxa" w:w="1728"/>
+          </w:tcPr>
+          <w:p>
+            <w:r>
+              <w:t>21:17</w:t>
+            </w:r>
+          </w:p>
+        </w:tc>
+        <w:tc>
+          <w:tcPr>
+            <w:tcW w:type="dxa" w:w="1728"/>
+          </w:tcPr>
+          <w:p>
+            <w:r>
+              <w:t>Тот же вопрос, что №5 (повтор)</w:t>
+            </w:r>
+          </w:p>
+        </w:tc>
+        <w:tc>
+          <w:tcPr>
+            <w:tcW w:type="dxa" w:w="1728"/>
+          </w:tcPr>
+          <w:p>
+            <w:r>
+              <w:t>Откройте Заказ покупателя; создайте к нему корректировку; укажите количество продукции к убавлению со знаком «−» (разница между заказанным и фактически выпущенным весом); если по продукту уже создан Заказ на производство — обратиться к ОБ. Источник: И-12-10-03 «Корректировка Заказу покупателя в 1С», с прямой цитатой.</w:t>
+            </w:r>
+          </w:p>
+        </w:tc>
+        <w:tc>
+          <w:tcPr>
+            <w:tcW w:type="dxa" w:w="1728"/>
+          </w:tcPr>
+          <w:p>
+            <w:r>
+              <w:t>Не зафиксирована на скриншоте</w:t>
+            </w:r>
+          </w:p>
+        </w:tc>
+      </w:tr>
     </w:tbl>
     <w:p>
       <w:r>

</xml_diff>

<commit_message>
Log 21:17 fix-verification: sырьё question clean, card matches text
Co-Authored-By: Claude Sonnet 5 <noreply@anthropic.com>
Claude-Session: https://claude.ai/code/session_01DpSN8JwCJ3tg3JVUadr2zE
</commit_message>
<xml_diff>
--- a/docs/accounts/eco/pilot-test-04-fix-verification.docx
+++ b/docs/accounts/eco/pilot-test-04-fix-verification.docx
@@ -1479,6 +1479,83 @@
           </w:p>
         </w:tc>
       </w:tr>
+      <w:tr>
+        <w:tc>
+          <w:tcPr>
+            <w:tcW w:type="dxa" w:w="1728"/>
+          </w:tcPr>
+          <w:p>
+            <w:r>
+              <w:t>21:17</w:t>
+            </w:r>
+          </w:p>
+        </w:tc>
+        <w:tc>
+          <w:tcPr>
+            <w:tcW w:type="dxa" w:w="1728"/>
+          </w:tcPr>
+          <w:p>
+            <w:r>
+              <w:t>Новый вопрос («Как технолог ПО получает сырьё на производство?»)</w:t>
+            </w:r>
+          </w:p>
+        </w:tc>
+        <w:tc>
+          <w:tcPr>
+            <w:tcW w:type="dxa" w:w="1728"/>
+          </w:tcPr>
+          <w:p>
+            <w:r>
+              <w:t>Агент/скоуп не видны на скриншоте</w:t>
+            </w:r>
+          </w:p>
+        </w:tc>
+        <w:tc>
+          <w:tcPr>
+            <w:tcW w:type="dxa" w:w="1728"/>
+          </w:tcPr>
+          <w:p>
+            <w:r>
+              <w:t xml:space="preserve">Ответ подробный: 1) в начале смены ответственный ПО получает от мастера ПО план «Производственный анализ» с номером заказа и оборудованием; 2) технолог ПО согласовывает с мастером ПО приоритетность задач; 3) в 1С8 во вкладке «Процесс» устанавливает флажок «Передать сырьё» и нажимает «Выгрузить WMS»; 4) если нет отметки «Подбор сырья завершён» — связывается по телефону с сотрудником СО. Источник в тексте — </w:t>
+            </w:r>
+            <w:r>
+              <w:rPr>
+                <w:b/>
+              </w:rPr>
+              <w:t>Д-08-07-01</w:t>
+            </w:r>
+            <w:r>
+              <w:t xml:space="preserve"> «Порядок получения ТМЦ с Участка выдачи сырья и сдача ТМЦ на участок возврата сырья и готовой продукции», п. 5.1–5.2. Карточка: </w:t>
+            </w:r>
+            <w:r>
+              <w:rPr>
+                <w:rFonts w:ascii="Consolas" w:hAnsi="Consolas"/>
+                <w:sz w:val="20"/>
+              </w:rPr>
+              <w:t>для теста ИИ (1)/Д-08-07-01 Порядок получения ТМЦ с Участка выдачи сырья и сдача ТМЦ...</w:t>
+            </w:r>
+            <w:r>
+              <w:t xml:space="preserve">, 48% — </w:t>
+            </w:r>
+            <w:r>
+              <w:rPr>
+                <w:b/>
+              </w:rPr>
+              <w:t>совпадает с текстом, Находка 2 не проявилась</w:t>
+            </w:r>
+          </w:p>
+        </w:tc>
+        <w:tc>
+          <w:tcPr>
+            <w:tcW w:type="dxa" w:w="1728"/>
+          </w:tcPr>
+          <w:p>
+            <w:r>
+              <w:t>Чисто — карточка/текст согласованы</w:t>
+            </w:r>
+          </w:p>
+        </w:tc>
+      </w:tr>
     </w:tbl>
     <w:p>
       <w:pPr>
@@ -2230,6 +2307,58 @@
           <w:p>
             <w:r>
               <w:t>Откройте Заказ покупателя; создайте к нему корректировку; укажите количество продукции к убавлению со знаком «−» (разница между заказанным и фактически выпущенным весом); если по продукту уже создан Заказ на производство — обратиться к ОБ. Источник: И-12-10-03 «Корректировка Заказу покупателя в 1С», с прямой цитатой.</w:t>
+            </w:r>
+          </w:p>
+        </w:tc>
+        <w:tc>
+          <w:tcPr>
+            <w:tcW w:type="dxa" w:w="1728"/>
+          </w:tcPr>
+          <w:p>
+            <w:r>
+              <w:t>Не зафиксирована на скриншоте</w:t>
+            </w:r>
+          </w:p>
+        </w:tc>
+      </w:tr>
+      <w:tr>
+        <w:tc>
+          <w:tcPr>
+            <w:tcW w:type="dxa" w:w="1728"/>
+          </w:tcPr>
+          <w:p>
+            <w:r>
+              <w:t>13</w:t>
+            </w:r>
+          </w:p>
+        </w:tc>
+        <w:tc>
+          <w:tcPr>
+            <w:tcW w:type="dxa" w:w="1728"/>
+          </w:tcPr>
+          <w:p>
+            <w:r>
+              <w:t>21:17</w:t>
+            </w:r>
+          </w:p>
+        </w:tc>
+        <w:tc>
+          <w:tcPr>
+            <w:tcW w:type="dxa" w:w="1728"/>
+          </w:tcPr>
+          <w:p>
+            <w:r>
+              <w:t>Как технолог ПО получает сырьё на производство?</w:t>
+            </w:r>
+          </w:p>
+        </w:tc>
+        <w:tc>
+          <w:tcPr>
+            <w:tcW w:type="dxa" w:w="1728"/>
+          </w:tcPr>
+          <w:p>
+            <w:r>
+              <w:t>1) в начале смены ответственный ПО получает от мастера ПО план «Производственный анализ» на рабочий день с номером заказа и оборудованием; 2) технолог ПО согласовывает с мастером ПО приоритетность задач; 3) в 1С8 во вкладке «Процесс» соответствующего заказа устанавливает флажок «Передать сырьё» и нажимает «Выгрузить WMS»; 4) если отсутствует отметка «Подбор сырья завершён» — технолог ПО по телефону связывается с сотрудником СО, сообщает о срочной сборке и передаче сырья, называет номер заказа, информирует ответственного сотрудника ПО. Источник: Д-08-07-01 «Порядок получения ТМЦ с Участка выдачи сырья и сдача ТМЦ на участок возврата сырья и готовой продукции», п. 5.1–5.2.</w:t>
             </w:r>
           </w:p>
         </w:tc>

</xml_diff>

<commit_message>
Log 21:18 fix-verification: sales-manager order-correction question, card clean
Third consecutive clean result on И-12-10-03-related questions.

Co-Authored-By: Claude Sonnet 5 <noreply@anthropic.com>
Claude-Session: https://claude.ai/code/session_01DpSN8JwCJ3tg3JVUadr2zE
</commit_message>
<xml_diff>
--- a/docs/accounts/eco/pilot-test-04-fix-verification.docx
+++ b/docs/accounts/eco/pilot-test-04-fix-verification.docx
@@ -1556,6 +1556,83 @@
           </w:p>
         </w:tc>
       </w:tr>
+      <w:tr>
+        <w:tc>
+          <w:tcPr>
+            <w:tcW w:type="dxa" w:w="1728"/>
+          </w:tcPr>
+          <w:p>
+            <w:r>
+              <w:t>21:18</w:t>
+            </w:r>
+          </w:p>
+        </w:tc>
+        <w:tc>
+          <w:tcPr>
+            <w:tcW w:type="dxa" w:w="1728"/>
+          </w:tcPr>
+          <w:p>
+            <w:r>
+              <w:t>Новый вопрос («Я менеджер по продажам. Клиент попросил поменять характеристику товара в уже оформленном заказе, но на складе уже распечатали заявку на сборку. Что делать?»)</w:t>
+            </w:r>
+          </w:p>
+        </w:tc>
+        <w:tc>
+          <w:tcPr>
+            <w:tcW w:type="dxa" w:w="1728"/>
+          </w:tcPr>
+          <w:p>
+            <w:r>
+              <w:t>Агент/скоуп не видны на скриншоте</w:t>
+            </w:r>
+          </w:p>
+        </w:tc>
+        <w:tc>
+          <w:tcPr>
+            <w:tcW w:type="dxa" w:w="1728"/>
+          </w:tcPr>
+          <w:p>
+            <w:r>
+              <w:t xml:space="preserve">Ответ подробный, с цитатами: 1) откройте Заказ покупателя и создайте корректировку к заказу; 2) в корректировке добавьте строку с исходной номенклатурой для удаления, новой строкой — ту же номенклатуру с требуемой характеристикой; 3) поскольку заявка на сборку уже распечатана — проверить, есть ли по продукту Заказ на производство: если есть — обратиться к ОБ, если нет — оформить корректировку самостоятельно. Источник в тексте — </w:t>
+            </w:r>
+            <w:r>
+              <w:rPr>
+                <w:b/>
+              </w:rPr>
+              <w:t>И-12-10-03</w:t>
+            </w:r>
+            <w:r>
+              <w:t xml:space="preserve"> «Корректировка Заказу покупателя в 1С», с тремя прямыми цитатами. Карточка: </w:t>
+            </w:r>
+            <w:r>
+              <w:rPr>
+                <w:rFonts w:ascii="Consolas" w:hAnsi="Consolas"/>
+                <w:sz w:val="20"/>
+              </w:rPr>
+              <w:t>для теста ИИ (1)/И-12-10-03 Корректировка Заказу покупателя в 1С.docx</w:t>
+            </w:r>
+            <w:r>
+              <w:t xml:space="preserve">, 65% — </w:t>
+            </w:r>
+            <w:r>
+              <w:rPr>
+                <w:b/>
+              </w:rPr>
+              <w:t>совпадает с текстом, Находка 2 не проявилась</w:t>
+            </w:r>
+          </w:p>
+        </w:tc>
+        <w:tc>
+          <w:tcPr>
+            <w:tcW w:type="dxa" w:w="1728"/>
+          </w:tcPr>
+          <w:p>
+            <w:r>
+              <w:t>Чисто — карточка/текст согласованы; третий подряд чистый результат по И-12-10-03 (после 21:03 и 21:17)</w:t>
+            </w:r>
+          </w:p>
+        </w:tc>
+      </w:tr>
     </w:tbl>
     <w:p>
       <w:pPr>
@@ -2359,6 +2436,58 @@
           <w:p>
             <w:r>
               <w:t>1) в начале смены ответственный ПО получает от мастера ПО план «Производственный анализ» на рабочий день с номером заказа и оборудованием; 2) технолог ПО согласовывает с мастером ПО приоритетность задач; 3) в 1С8 во вкладке «Процесс» соответствующего заказа устанавливает флажок «Передать сырьё» и нажимает «Выгрузить WMS»; 4) если отсутствует отметка «Подбор сырья завершён» — технолог ПО по телефону связывается с сотрудником СО, сообщает о срочной сборке и передаче сырья, называет номер заказа, информирует ответственного сотрудника ПО. Источник: Д-08-07-01 «Порядок получения ТМЦ с Участка выдачи сырья и сдача ТМЦ на участок возврата сырья и готовой продукции», п. 5.1–5.2.</w:t>
+            </w:r>
+          </w:p>
+        </w:tc>
+        <w:tc>
+          <w:tcPr>
+            <w:tcW w:type="dxa" w:w="1728"/>
+          </w:tcPr>
+          <w:p>
+            <w:r>
+              <w:t>Не зафиксирована на скриншоте</w:t>
+            </w:r>
+          </w:p>
+        </w:tc>
+      </w:tr>
+      <w:tr>
+        <w:tc>
+          <w:tcPr>
+            <w:tcW w:type="dxa" w:w="1728"/>
+          </w:tcPr>
+          <w:p>
+            <w:r>
+              <w:t>14</w:t>
+            </w:r>
+          </w:p>
+        </w:tc>
+        <w:tc>
+          <w:tcPr>
+            <w:tcW w:type="dxa" w:w="1728"/>
+          </w:tcPr>
+          <w:p>
+            <w:r>
+              <w:t>21:18</w:t>
+            </w:r>
+          </w:p>
+        </w:tc>
+        <w:tc>
+          <w:tcPr>
+            <w:tcW w:type="dxa" w:w="1728"/>
+          </w:tcPr>
+          <w:p>
+            <w:r>
+              <w:t>Я менеджер по продажам. Клиент попросил поменять характеристику товара в уже оформленном заказе, но на складе уже распечатали заявку на сборку. Что делать?</w:t>
+            </w:r>
+          </w:p>
+        </w:tc>
+        <w:tc>
+          <w:tcPr>
+            <w:tcW w:type="dxa" w:w="1728"/>
+          </w:tcPr>
+          <w:p>
+            <w:r>
+              <w:t>1) откройте Заказ покупателя и создайте корректировку к заказу; 2) добавьте строку с исходной номенклатурой для удаления, новой строкой — ту же номенклатуру с требуемой характеристикой; 3) так как заявка на сборку уже распечатана — проверьте, есть ли по продукту Заказ на производство: если есть — обратитесь к ОБ, если нет — оформите корректировку самостоятельно. Источник: И-12-10-03 «Корректировка Заказу покупателя в 1С», с тремя прямыми цитатами из документа.</w:t>
             </w:r>
           </w:p>
         </w:tc>

</xml_diff>

<commit_message>
Log 21:19 fix-verification: production-brak question, both cards clean
Co-Authored-By: Claude Sonnet 5 <noreply@anthropic.com>
Claude-Session: https://claude.ai/code/session_01DpSN8JwCJ3tg3JVUadr2zE
</commit_message>
<xml_diff>
--- a/docs/accounts/eco/pilot-test-04-fix-verification.docx
+++ b/docs/accounts/eco/pilot-test-04-fix-verification.docx
@@ -1633,6 +1633,102 @@
           </w:p>
         </w:tc>
       </w:tr>
+      <w:tr>
+        <w:tc>
+          <w:tcPr>
+            <w:tcW w:type="dxa" w:w="1728"/>
+          </w:tcPr>
+          <w:p>
+            <w:r>
+              <w:t>21:19</w:t>
+            </w:r>
+          </w:p>
+        </w:tc>
+        <w:tc>
+          <w:tcPr>
+            <w:tcW w:type="dxa" w:w="1728"/>
+          </w:tcPr>
+          <w:p>
+            <w:r>
+              <w:t>Новый вопрос («Продукцию забраковали на производстве, кто и какие действия должен совершить?»)</w:t>
+            </w:r>
+          </w:p>
+        </w:tc>
+        <w:tc>
+          <w:tcPr>
+            <w:tcW w:type="dxa" w:w="1728"/>
+          </w:tcPr>
+          <w:p>
+            <w:r>
+              <w:t>Агент/скоуп не видны на скриншоте</w:t>
+            </w:r>
+          </w:p>
+        </w:tc>
+        <w:tc>
+          <w:tcPr>
+            <w:tcW w:type="dxa" w:w="1728"/>
+          </w:tcPr>
+          <w:p>
+            <w:r>
+              <w:t xml:space="preserve">Ответ подробный, два источника: 1) Оператор ПО прекращает выпуск, сообщает мастеру ПО и технологу ПО; 2) Мастер ПО — организует изоляцию расфасованной продукции или сообщает ведущему технологу ПО/начальнику ПУ/тех. директору, если не расфасована; 3) Ведущий технолог ПО действует согласно ПР-17-00 и ПР-03-00, сообщает группе БПП; 4) Группа БПП действует согласно ПР-04-00; решение о несоответствии — руководитель ОКК/директор по качеству, оформление актами 03-01/03-02/03-04 и журналом 03-03; отдельно — про инородный предмет (потенциально небезопасная продукция). Источники в тексте — </w:t>
+            </w:r>
+            <w:r>
+              <w:rPr>
+                <w:b/>
+              </w:rPr>
+              <w:t>ПР-03-00-12</w:t>
+            </w:r>
+            <w:r>
+              <w:t xml:space="preserve"> «Несоответствующая продукция» и </w:t>
+            </w:r>
+            <w:r>
+              <w:rPr>
+                <w:b/>
+              </w:rPr>
+              <w:t>И-08-03-09</w:t>
+            </w:r>
+            <w:r>
+              <w:t xml:space="preserve"> «Действия при нештатных ситуациях». Карточки: 1) </w:t>
+            </w:r>
+            <w:r>
+              <w:rPr>
+                <w:rFonts w:ascii="Consolas" w:hAnsi="Consolas"/>
+                <w:sz w:val="20"/>
+              </w:rPr>
+              <w:t>для теста ИИ (1)/ПР-03-00-12 Несоответствующая продукция.doc</w:t>
+            </w:r>
+            <w:r>
+              <w:t xml:space="preserve">, 62%; 2) </w:t>
+            </w:r>
+            <w:r>
+              <w:rPr>
+                <w:rFonts w:ascii="Consolas" w:hAnsi="Consolas"/>
+                <w:sz w:val="20"/>
+              </w:rPr>
+              <w:t>для теста ИИ (1)/И-08-03-09 Действия при нештатных ситуациях.doc</w:t>
+            </w:r>
+            <w:r>
+              <w:t xml:space="preserve">, 62% — </w:t>
+            </w:r>
+            <w:r>
+              <w:rPr>
+                <w:b/>
+              </w:rPr>
+              <w:t>обе совпадают с текстом, Находка 2 не проявилась</w:t>
+            </w:r>
+          </w:p>
+        </w:tc>
+        <w:tc>
+          <w:tcPr>
+            <w:tcW w:type="dxa" w:w="1728"/>
+          </w:tcPr>
+          <w:p>
+            <w:r>
+              <w:t>Чисто — оба источника совпадают с текстом</w:t>
+            </w:r>
+          </w:p>
+        </w:tc>
+      </w:tr>
     </w:tbl>
     <w:p>
       <w:pPr>
@@ -2488,6 +2584,58 @@
           <w:p>
             <w:r>
               <w:t>1) откройте Заказ покупателя и создайте корректировку к заказу; 2) добавьте строку с исходной номенклатурой для удаления, новой строкой — ту же номенклатуру с требуемой характеристикой; 3) так как заявка на сборку уже распечатана — проверьте, есть ли по продукту Заказ на производство: если есть — обратитесь к ОБ, если нет — оформите корректировку самостоятельно. Источник: И-12-10-03 «Корректировка Заказу покупателя в 1С», с тремя прямыми цитатами из документа.</w:t>
+            </w:r>
+          </w:p>
+        </w:tc>
+        <w:tc>
+          <w:tcPr>
+            <w:tcW w:type="dxa" w:w="1728"/>
+          </w:tcPr>
+          <w:p>
+            <w:r>
+              <w:t>Не зафиксирована на скриншоте</w:t>
+            </w:r>
+          </w:p>
+        </w:tc>
+      </w:tr>
+      <w:tr>
+        <w:tc>
+          <w:tcPr>
+            <w:tcW w:type="dxa" w:w="1728"/>
+          </w:tcPr>
+          <w:p>
+            <w:r>
+              <w:t>15</w:t>
+            </w:r>
+          </w:p>
+        </w:tc>
+        <w:tc>
+          <w:tcPr>
+            <w:tcW w:type="dxa" w:w="1728"/>
+          </w:tcPr>
+          <w:p>
+            <w:r>
+              <w:t>21:19</w:t>
+            </w:r>
+          </w:p>
+        </w:tc>
+        <w:tc>
+          <w:tcPr>
+            <w:tcW w:type="dxa" w:w="1728"/>
+          </w:tcPr>
+          <w:p>
+            <w:r>
+              <w:t>Продукцию забраковали на производстве, кто и какие действия должен совершить?</w:t>
+            </w:r>
+          </w:p>
+        </w:tc>
+        <w:tc>
+          <w:tcPr>
+            <w:tcW w:type="dxa" w:w="1728"/>
+          </w:tcPr>
+          <w:p>
+            <w:r>
+              <w:t>1) Оператор ПО прекращает выпуск, сообщает мастеру ПО и технологу ПО; 2) Мастер ПО — изолирует расфасованную продукцию или сообщает ведущему технологу ПО/начальнику ПУ/тех. директору, если не расфасована; 3) Ведущий технолог ПО действует согласно ПР-17-00 и ПР-03-00, сообщает группе БПП; 4) Группа БПП действует согласно ПР-04-00. Решение о несоответствии — руководитель ОКК/директор по качеству; оформление актами «Акт забраковки ТМЦ» (форма 03-01), «Акт разрешения на отклонение» (форма 03-02), «Акт на утилизацию» (форма 03-04) и записью в журнале 03-03. Если причина — инородный предмет, продукция считается потенциально небезопасной. Источники: ПР-03-00-12 «Несоответствующая продукция»; И-08-03-09 «Действия при нештатных ситуациях».</w:t>
             </w:r>
           </w:p>
         </w:tc>

</xml_diff>

<commit_message>
Log 21:20 fix-verification: stretch-film question, pattern confirmed again
First attempt: "not found" but a card shown anyway (50%). Retry: correct doc (И-08-02-10) again ranks #2 at 0%, unrelated doc ranks #1 at 47% — third confirmation of the wrong-doc-on-top/correct-doc-zero-score pattern.

Co-Authored-By: Claude Sonnet 5 <noreply@anthropic.com>
Claude-Session: https://claude.ai/code/session_01DpSN8JwCJ3tg3JVUadr2zE
</commit_message>
<xml_diff>
--- a/docs/accounts/eco/pilot-test-04-fix-verification.docx
+++ b/docs/accounts/eco/pilot-test-04-fix-verification.docx
@@ -1729,6 +1729,189 @@
           </w:p>
         </w:tc>
       </w:tr>
+      <w:tr>
+        <w:tc>
+          <w:tcPr>
+            <w:tcW w:type="dxa" w:w="1728"/>
+          </w:tcPr>
+          <w:p>
+            <w:r>
+              <w:t>21:20</w:t>
+            </w:r>
+          </w:p>
+        </w:tc>
+        <w:tc>
+          <w:tcPr>
+            <w:tcW w:type="dxa" w:w="1728"/>
+          </w:tcPr>
+          <w:p>
+            <w:r>
+              <w:t>Новый вопрос («Какой маркой стретч-плёнки обматывают паллеты с готовой продукцией?») — первая попытка</w:t>
+            </w:r>
+          </w:p>
+        </w:tc>
+        <w:tc>
+          <w:tcPr>
+            <w:tcW w:type="dxa" w:w="1728"/>
+          </w:tcPr>
+          <w:p>
+            <w:r>
+              <w:t>Агент/скоуп не видны на скриншоте</w:t>
+            </w:r>
+          </w:p>
+        </w:tc>
+        <w:tc>
+          <w:tcPr>
+            <w:tcW w:type="dxa" w:w="1728"/>
+          </w:tcPr>
+          <w:p>
+            <w:r>
+              <w:t xml:space="preserve">Ответ: «в доступных источниках не нашёл марку стретч-плёнки для обмотки паллет с готовой продукцией» — текст не называет источник (ничего не найдено), но карточка всё равно показана. Карточка: </w:t>
+            </w:r>
+            <w:r>
+              <w:rPr>
+                <w:rFonts w:ascii="Consolas" w:hAnsi="Consolas"/>
+                <w:sz w:val="20"/>
+              </w:rPr>
+              <w:t>для теста ИИ (1)/Д-09-01-17 План контроля тары и упаковки.docx</w:t>
+            </w:r>
+            <w:r>
+              <w:t>, 50%</w:t>
+            </w:r>
+          </w:p>
+        </w:tc>
+        <w:tc>
+          <w:tcPr>
+            <w:tcW w:type="dxa" w:w="1728"/>
+          </w:tcPr>
+          <w:p>
+            <w:r>
+              <w:t>Не диагностично напрямую (нет текстовой цитаты для сравнения), но само наличие карточки при «не найдено» — странно: если релевантного источника нет, зачем показывать карточку с 50%?</w:t>
+            </w:r>
+          </w:p>
+        </w:tc>
+      </w:tr>
+      <w:tr>
+        <w:tc>
+          <w:tcPr>
+            <w:tcW w:type="dxa" w:w="1728"/>
+          </w:tcPr>
+          <w:p>
+            <w:r>
+              <w:t>21:20</w:t>
+            </w:r>
+          </w:p>
+        </w:tc>
+        <w:tc>
+          <w:tcPr>
+            <w:tcW w:type="dxa" w:w="1728"/>
+          </w:tcPr>
+          <w:p>
+            <w:r>
+              <w:t>Тот же вопрос задан повторно</w:t>
+            </w:r>
+          </w:p>
+        </w:tc>
+        <w:tc>
+          <w:tcPr>
+            <w:tcW w:type="dxa" w:w="1728"/>
+          </w:tcPr>
+          <w:p>
+            <w:r>
+              <w:t>Агент/скоуп не видны на скриншоте</w:t>
+            </w:r>
+          </w:p>
+        </w:tc>
+        <w:tc>
+          <w:tcPr>
+            <w:tcW w:type="dxa" w:w="1728"/>
+          </w:tcPr>
+          <w:p>
+            <w:r>
+              <w:t xml:space="preserve">Ответ теперь содержательный: «марка стретч-плёнки не указана, но установлено требование — обматывать не менее трёх оборотов на один ряд». Источник в тексте — </w:t>
+            </w:r>
+            <w:r>
+              <w:rPr>
+                <w:b/>
+              </w:rPr>
+              <w:t>И-08-02-10</w:t>
+            </w:r>
+            <w:r>
+              <w:t xml:space="preserve"> «Фасовка и упаковка готовой продукции», файл </w:t>
+            </w:r>
+            <w:r>
+              <w:rPr>
+                <w:rFonts w:ascii="Consolas" w:hAnsi="Consolas"/>
+                <w:sz w:val="20"/>
+              </w:rPr>
+              <w:t>instrukciya-08-02-10.docx</w:t>
+            </w:r>
+            <w:r>
+              <w:t xml:space="preserve">. Карточки: 1) </w:t>
+            </w:r>
+            <w:r>
+              <w:rPr>
+                <w:rFonts w:ascii="Consolas" w:hAnsi="Consolas"/>
+                <w:sz w:val="20"/>
+              </w:rPr>
+              <w:t>eco-converted-for-upload/forma-09-01-plan-kontrolya-tary-i-upakovki.docx</w:t>
+            </w:r>
+            <w:r>
+              <w:t xml:space="preserve">, </w:t>
+            </w:r>
+            <w:r>
+              <w:rPr>
+                <w:b/>
+              </w:rPr>
+              <w:t>47%</w:t>
+            </w:r>
+            <w:r>
+              <w:t xml:space="preserve">; 2) </w:t>
+            </w:r>
+            <w:r>
+              <w:rPr>
+                <w:rFonts w:ascii="Consolas" w:hAnsi="Consolas"/>
+                <w:sz w:val="20"/>
+              </w:rPr>
+              <w:t>instrukciya-08-02-10.docx</w:t>
+            </w:r>
+            <w:r>
+              <w:t xml:space="preserve">, </w:t>
+            </w:r>
+            <w:r>
+              <w:rPr>
+                <w:b/>
+              </w:rPr>
+              <w:t>0%</w:t>
+            </w:r>
+            <w:r>
+              <w:t xml:space="preserve"> — </w:t>
+            </w:r>
+            <w:r>
+              <w:rPr>
+                <w:b/>
+              </w:rPr>
+              <w:t>тот же паттерн: правильный документ вторым с 0%, посторонний — первым с ненулевым %</w:t>
+            </w:r>
+          </w:p>
+        </w:tc>
+        <w:tc>
+          <w:tcPr>
+            <w:tcW w:type="dxa" w:w="1728"/>
+          </w:tcPr>
+          <w:p>
+            <w:r>
+              <w:rPr>
+                <w:b/>
+              </w:rPr>
+              <w:t>Не исправлено — паттерн подтверждён в третий раз</w:t>
+            </w:r>
+            <w:r>
+              <w:t xml:space="preserve"> (после 21:00/21:15 и 21:15-повтора): правильный источник систематически показывается вторым с нулевым скором, а не первым</w:t>
+            </w:r>
+          </w:p>
+        </w:tc>
+      </w:tr>
     </w:tbl>
     <w:p>
       <w:pPr>
@@ -2636,6 +2819,110 @@
           <w:p>
             <w:r>
               <w:t>1) Оператор ПО прекращает выпуск, сообщает мастеру ПО и технологу ПО; 2) Мастер ПО — изолирует расфасованную продукцию или сообщает ведущему технологу ПО/начальнику ПУ/тех. директору, если не расфасована; 3) Ведущий технолог ПО действует согласно ПР-17-00 и ПР-03-00, сообщает группе БПП; 4) Группа БПП действует согласно ПР-04-00. Решение о несоответствии — руководитель ОКК/директор по качеству; оформление актами «Акт забраковки ТМЦ» (форма 03-01), «Акт разрешения на отклонение» (форма 03-02), «Акт на утилизацию» (форма 03-04) и записью в журнале 03-03. Если причина — инородный предмет, продукция считается потенциально небезопасной. Источники: ПР-03-00-12 «Несоответствующая продукция»; И-08-03-09 «Действия при нештатных ситуациях».</w:t>
+            </w:r>
+          </w:p>
+        </w:tc>
+        <w:tc>
+          <w:tcPr>
+            <w:tcW w:type="dxa" w:w="1728"/>
+          </w:tcPr>
+          <w:p>
+            <w:r>
+              <w:t>Не зафиксирована на скриншоте</w:t>
+            </w:r>
+          </w:p>
+        </w:tc>
+      </w:tr>
+      <w:tr>
+        <w:tc>
+          <w:tcPr>
+            <w:tcW w:type="dxa" w:w="1728"/>
+          </w:tcPr>
+          <w:p>
+            <w:r>
+              <w:t>16</w:t>
+            </w:r>
+          </w:p>
+        </w:tc>
+        <w:tc>
+          <w:tcPr>
+            <w:tcW w:type="dxa" w:w="1728"/>
+          </w:tcPr>
+          <w:p>
+            <w:r>
+              <w:t>21:20</w:t>
+            </w:r>
+          </w:p>
+        </w:tc>
+        <w:tc>
+          <w:tcPr>
+            <w:tcW w:type="dxa" w:w="1728"/>
+          </w:tcPr>
+          <w:p>
+            <w:r>
+              <w:t>Какой маркой стретч-плёнки обматывают паллеты с готовой продукцией? (1-я попытка)</w:t>
+            </w:r>
+          </w:p>
+        </w:tc>
+        <w:tc>
+          <w:tcPr>
+            <w:tcW w:type="dxa" w:w="1728"/>
+          </w:tcPr>
+          <w:p>
+            <w:r>
+              <w:t>В доступных источниках не нашёл марку стретч-плёнки для обмотки паллет с готовой продукцией.</w:t>
+            </w:r>
+          </w:p>
+        </w:tc>
+        <w:tc>
+          <w:tcPr>
+            <w:tcW w:type="dxa" w:w="1728"/>
+          </w:tcPr>
+          <w:p>
+            <w:r>
+              <w:t>Не зафиксирована на скриншоте</w:t>
+            </w:r>
+          </w:p>
+        </w:tc>
+      </w:tr>
+      <w:tr>
+        <w:tc>
+          <w:tcPr>
+            <w:tcW w:type="dxa" w:w="1728"/>
+          </w:tcPr>
+          <w:p>
+            <w:r>
+              <w:t>17</w:t>
+            </w:r>
+          </w:p>
+        </w:tc>
+        <w:tc>
+          <w:tcPr>
+            <w:tcW w:type="dxa" w:w="1728"/>
+          </w:tcPr>
+          <w:p>
+            <w:r>
+              <w:t>21:20</w:t>
+            </w:r>
+          </w:p>
+        </w:tc>
+        <w:tc>
+          <w:tcPr>
+            <w:tcW w:type="dxa" w:w="1728"/>
+          </w:tcPr>
+          <w:p>
+            <w:r>
+              <w:t>Тот же вопрос (повтор)</w:t>
+            </w:r>
+          </w:p>
+        </w:tc>
+        <w:tc>
+          <w:tcPr>
+            <w:tcW w:type="dxa" w:w="1728"/>
+          </w:tcPr>
+          <w:p>
+            <w:r>
+              <w:t>Марка стретч-плёнки не указана; установлено требование — обматывать не менее трёх оборотов на один ряд. Источник: И-08-02-10 «Фасовка и упаковка готовой продукции».</w:t>
             </w:r>
           </w:p>
         </w:tc>

</xml_diff>

<commit_message>
Log 21:22 fix-verification: contractor-evaluation question, ranking pattern again
Correct doc (И-14-00-12) ranks last (3rd of 3, 38%) below two unrelated documents — a variation of the recurring wrong-ranking pattern, this time without a 0% score.

Co-Authored-By: Claude Sonnet 5 <noreply@anthropic.com>
Claude-Session: https://claude.ai/code/session_01DpSN8JwCJ3tg3JVUadr2zE
</commit_message>
<xml_diff>
--- a/docs/accounts/eco/pilot-test-04-fix-verification.docx
+++ b/docs/accounts/eco/pilot-test-04-fix-verification.docx
@@ -1912,6 +1912,207 @@
           </w:p>
         </w:tc>
       </w:tr>
+      <w:tr>
+        <w:tc>
+          <w:tcPr>
+            <w:tcW w:type="dxa" w:w="1728"/>
+          </w:tcPr>
+          <w:p>
+            <w:r>
+              <w:t>21:22</w:t>
+            </w:r>
+          </w:p>
+        </w:tc>
+        <w:tc>
+          <w:tcPr>
+            <w:tcW w:type="dxa" w:w="1728"/>
+          </w:tcPr>
+          <w:p>
+            <w:r>
+              <w:t>Новый вопрос («Как часто нужно оценивать квалификацию внештатных сотрудников, которые работают по договору подряда?») — 1-я попытка</w:t>
+            </w:r>
+          </w:p>
+        </w:tc>
+        <w:tc>
+          <w:tcPr>
+            <w:tcW w:type="dxa" w:w="1728"/>
+          </w:tcPr>
+          <w:p>
+            <w:r>
+              <w:t>Агент/скоуп не видны на скриншоте</w:t>
+            </w:r>
+          </w:p>
+        </w:tc>
+        <w:tc>
+          <w:tcPr>
+            <w:tcW w:type="dxa" w:w="1728"/>
+          </w:tcPr>
+          <w:p>
+            <w:r>
+              <w:t>«В доступных источниках не нашёл периодичность...» — текст без указания источника. Карточки: И-08-04-13 (47%), ПР-14-00-12 (47%), Д-17-12-03 (46%), И-08-03-09 (46%), И-15-06-08 (45%) — 5 карточек без явной привязки к тексту («не найдено»)</w:t>
+            </w:r>
+          </w:p>
+        </w:tc>
+        <w:tc>
+          <w:tcPr>
+            <w:tcW w:type="dxa" w:w="1728"/>
+          </w:tcPr>
+          <w:p>
+            <w:r>
+              <w:t>Не диагностично напрямую, отмечено для полноты (снова карточки показаны при «не найдено»)</w:t>
+            </w:r>
+          </w:p>
+        </w:tc>
+      </w:tr>
+      <w:tr>
+        <w:tc>
+          <w:tcPr>
+            <w:tcW w:type="dxa" w:w="1728"/>
+          </w:tcPr>
+          <w:p>
+            <w:r>
+              <w:t>21:22</w:t>
+            </w:r>
+          </w:p>
+        </w:tc>
+        <w:tc>
+          <w:tcPr>
+            <w:tcW w:type="dxa" w:w="1728"/>
+          </w:tcPr>
+          <w:p>
+            <w:r>
+              <w:t>Тот же вопрос задан повторно</w:t>
+            </w:r>
+          </w:p>
+        </w:tc>
+        <w:tc>
+          <w:tcPr>
+            <w:tcW w:type="dxa" w:w="1728"/>
+          </w:tcPr>
+          <w:p>
+            <w:r>
+              <w:t>Агент/скоуп не видны на скриншоте</w:t>
+            </w:r>
+          </w:p>
+        </w:tc>
+        <w:tc>
+          <w:tcPr>
+            <w:tcW w:type="dxa" w:w="1728"/>
+          </w:tcPr>
+          <w:p>
+            <w:r>
+              <w:t xml:space="preserve">Ответ содержательный: периодичность для договора подряда не указана; по инструкции оценка персонала проводится </w:t>
+            </w:r>
+            <w:r>
+              <w:rPr>
+                <w:b/>
+              </w:rPr>
+              <w:t>по необходимости</w:t>
+            </w:r>
+            <w:r>
+              <w:t xml:space="preserve"> (для выявления потребности в обучении, формирования проектных команд, выявления резервов, при увеличении оклада или по решению руководителя) — это положение не устанавливает график для сотрудников по договору подряда. Источник в тексте — </w:t>
+            </w:r>
+            <w:r>
+              <w:rPr>
+                <w:b/>
+              </w:rPr>
+              <w:t>И-14-00-12</w:t>
+            </w:r>
+            <w:r>
+              <w:t xml:space="preserve"> «Оценка персонала», файл </w:t>
+            </w:r>
+            <w:r>
+              <w:rPr>
+                <w:rFonts w:ascii="Consolas" w:hAnsi="Consolas"/>
+                <w:sz w:val="20"/>
+              </w:rPr>
+              <w:t>instrukciya-14-00-12.docx</w:t>
+            </w:r>
+            <w:r>
+              <w:t xml:space="preserve">, п. 5.3, score 0.3757, с цитатой. Карточки: 1) </w:t>
+            </w:r>
+            <w:r>
+              <w:rPr>
+                <w:rFonts w:ascii="Consolas" w:hAnsi="Consolas"/>
+                <w:sz w:val="20"/>
+              </w:rPr>
+              <w:t>eco-converted-for-upload/procedura-pr-10-02-00-remontno-mehanicheskaya-sluzhba.docx</w:t>
+            </w:r>
+            <w:r>
+              <w:t xml:space="preserve">, </w:t>
+            </w:r>
+            <w:r>
+              <w:rPr>
+                <w:b/>
+              </w:rPr>
+              <w:t>49%</w:t>
+            </w:r>
+            <w:r>
+              <w:t xml:space="preserve">; 2) </w:t>
+            </w:r>
+            <w:r>
+              <w:rPr>
+                <w:rFonts w:ascii="Consolas" w:hAnsi="Consolas"/>
+                <w:sz w:val="20"/>
+              </w:rPr>
+              <w:t>eco-converted-for-upload/dokument-17-12-03.docx</w:t>
+            </w:r>
+            <w:r>
+              <w:t xml:space="preserve">, </w:t>
+            </w:r>
+            <w:r>
+              <w:rPr>
+                <w:b/>
+              </w:rPr>
+              <w:t>48%</w:t>
+            </w:r>
+            <w:r>
+              <w:t xml:space="preserve">; 3) </w:t>
+            </w:r>
+            <w:r>
+              <w:rPr>
+                <w:rFonts w:ascii="Consolas" w:hAnsi="Consolas"/>
+                <w:sz w:val="20"/>
+              </w:rPr>
+              <w:t>instrukciya-14-00-12.docx</w:t>
+            </w:r>
+            <w:r>
+              <w:t xml:space="preserve">, </w:t>
+            </w:r>
+            <w:r>
+              <w:rPr>
+                <w:b/>
+              </w:rPr>
+              <w:t>38%</w:t>
+            </w:r>
+            <w:r>
+              <w:t xml:space="preserve"> — </w:t>
+            </w:r>
+            <w:r>
+              <w:rPr>
+                <w:b/>
+              </w:rPr>
+              <w:t>правильный документ снова не на первом месте (3-й из 3-х), хотя и не 0%</w:t>
+            </w:r>
+          </w:p>
+        </w:tc>
+        <w:tc>
+          <w:tcPr>
+            <w:tcW w:type="dxa" w:w="1728"/>
+          </w:tcPr>
+          <w:p>
+            <w:r>
+              <w:rPr>
+                <w:b/>
+              </w:rPr>
+              <w:t>Не исправлено, паттерн (вариация).</w:t>
+            </w:r>
+            <w:r>
+              <w:t xml:space="preserve"> Тот же тип аномалии: реально процитированный документ ранжирован ниже двух нерелевантных — на этот раз не 0%, но последний по счёту и с самым низким скором</w:t>
+            </w:r>
+          </w:p>
+        </w:tc>
+      </w:tr>
     </w:tbl>
     <w:p>
       <w:pPr>
@@ -2923,6 +3124,110 @@
           <w:p>
             <w:r>
               <w:t>Марка стретч-плёнки не указана; установлено требование — обматывать не менее трёх оборотов на один ряд. Источник: И-08-02-10 «Фасовка и упаковка готовой продукции».</w:t>
+            </w:r>
+          </w:p>
+        </w:tc>
+        <w:tc>
+          <w:tcPr>
+            <w:tcW w:type="dxa" w:w="1728"/>
+          </w:tcPr>
+          <w:p>
+            <w:r>
+              <w:t>Не зафиксирована на скриншоте</w:t>
+            </w:r>
+          </w:p>
+        </w:tc>
+      </w:tr>
+      <w:tr>
+        <w:tc>
+          <w:tcPr>
+            <w:tcW w:type="dxa" w:w="1728"/>
+          </w:tcPr>
+          <w:p>
+            <w:r>
+              <w:t>18</w:t>
+            </w:r>
+          </w:p>
+        </w:tc>
+        <w:tc>
+          <w:tcPr>
+            <w:tcW w:type="dxa" w:w="1728"/>
+          </w:tcPr>
+          <w:p>
+            <w:r>
+              <w:t>21:22</w:t>
+            </w:r>
+          </w:p>
+        </w:tc>
+        <w:tc>
+          <w:tcPr>
+            <w:tcW w:type="dxa" w:w="1728"/>
+          </w:tcPr>
+          <w:p>
+            <w:r>
+              <w:t>Как часто нужно оценивать квалификацию внештатных сотрудников, которые работают по договору подряда? (1-я попытка)</w:t>
+            </w:r>
+          </w:p>
+        </w:tc>
+        <w:tc>
+          <w:tcPr>
+            <w:tcW w:type="dxa" w:w="1728"/>
+          </w:tcPr>
+          <w:p>
+            <w:r>
+              <w:t>В доступных источниках не нашёл периодичность оценки квалификации внештатных сотрудников, работающих по договору подряда.</w:t>
+            </w:r>
+          </w:p>
+        </w:tc>
+        <w:tc>
+          <w:tcPr>
+            <w:tcW w:type="dxa" w:w="1728"/>
+          </w:tcPr>
+          <w:p>
+            <w:r>
+              <w:t>Не зафиксирована на скриншоте</w:t>
+            </w:r>
+          </w:p>
+        </w:tc>
+      </w:tr>
+      <w:tr>
+        <w:tc>
+          <w:tcPr>
+            <w:tcW w:type="dxa" w:w="1728"/>
+          </w:tcPr>
+          <w:p>
+            <w:r>
+              <w:t>19</w:t>
+            </w:r>
+          </w:p>
+        </w:tc>
+        <w:tc>
+          <w:tcPr>
+            <w:tcW w:type="dxa" w:w="1728"/>
+          </w:tcPr>
+          <w:p>
+            <w:r>
+              <w:t>21:22</w:t>
+            </w:r>
+          </w:p>
+        </w:tc>
+        <w:tc>
+          <w:tcPr>
+            <w:tcW w:type="dxa" w:w="1728"/>
+          </w:tcPr>
+          <w:p>
+            <w:r>
+              <w:t>Тот же вопрос (повтор)</w:t>
+            </w:r>
+          </w:p>
+        </w:tc>
+        <w:tc>
+          <w:tcPr>
+            <w:tcW w:type="dxa" w:w="1728"/>
+          </w:tcPr>
+          <w:p>
+            <w:r>
+              <w:t>Периодичность для договора подряда не указана; по инструкции оценка персонала проводится по необходимости (выявление потребности в обучении, формирование проектных команд, выявление резервов, увеличение оклада, решение руководителя) — это не устанавливает график для сотрудников по договору подряда. Источник: И-14-00-12 «Оценка персонала», п. 5.3.</w:t>
             </w:r>
           </w:p>
         </w:tc>

</xml_diff>

<commit_message>
Log 21:24 fix-verification: cleaning-log-form question, correct doc last at 0% again
4th confirmation of the recurring pattern: correct cited doc (И-08-04-13) ranks last at 0%, two unrelated docs rank above it.

Co-Authored-By: Claude Sonnet 5 <noreply@anthropic.com>
Claude-Session: https://claude.ai/code/session_01DpSN8JwCJ3tg3JVUadr2zE
</commit_message>
<xml_diff>
--- a/docs/accounts/eco/pilot-test-04-fix-verification.docx
+++ b/docs/accounts/eco/pilot-test-04-fix-verification.docx
@@ -2113,6 +2113,136 @@
           </w:p>
         </w:tc>
       </w:tr>
+      <w:tr>
+        <w:tc>
+          <w:tcPr>
+            <w:tcW w:type="dxa" w:w="1728"/>
+          </w:tcPr>
+          <w:p>
+            <w:r>
+              <w:t>21:24</w:t>
+            </w:r>
+          </w:p>
+        </w:tc>
+        <w:tc>
+          <w:tcPr>
+            <w:tcW w:type="dxa" w:w="1728"/>
+          </w:tcPr>
+          <w:p>
+            <w:r>
+              <w:t>Новый вопрос («Какие поля должны быть заполнены в журнале «Учёт уборки производственного оборудования» Форма 17-08?»)</w:t>
+            </w:r>
+          </w:p>
+        </w:tc>
+        <w:tc>
+          <w:tcPr>
+            <w:tcW w:type="dxa" w:w="1728"/>
+          </w:tcPr>
+          <w:p>
+            <w:r>
+              <w:t>Агент/скоуп не видны на скриншоте</w:t>
+            </w:r>
+          </w:p>
+        </w:tc>
+        <w:tc>
+          <w:tcPr>
+            <w:tcW w:type="dxa" w:w="1728"/>
+          </w:tcPr>
+          <w:p>
+            <w:r>
+              <w:t xml:space="preserve">Перечень полей Формы 17-08 не приведён в источниках; указано только, что Форма 17-08 используется как чек-лист проверки ППУ и обхода санитарного состояния производства, контроль уборочного инвентаря — еженедельно ответственным сотрудником ПО. Источник в тексте — </w:t>
+            </w:r>
+            <w:r>
+              <w:rPr>
+                <w:b/>
+              </w:rPr>
+              <w:t>И-08-04-13</w:t>
+            </w:r>
+            <w:r>
+              <w:t xml:space="preserve"> «Уборка чистой зоны», п. 4.4. Карточки: 1) </w:t>
+            </w:r>
+            <w:r>
+              <w:rPr>
+                <w:rFonts w:ascii="Consolas" w:hAnsi="Consolas"/>
+                <w:sz w:val="20"/>
+              </w:rPr>
+              <w:t>для теста ИИ (1)/Д-11-06-01 Выдача собранных заказов на производство.doc</w:t>
+            </w:r>
+            <w:r>
+              <w:t xml:space="preserve">, </w:t>
+            </w:r>
+            <w:r>
+              <w:rPr>
+                <w:b/>
+              </w:rPr>
+              <w:t>73%</w:t>
+            </w:r>
+            <w:r>
+              <w:t xml:space="preserve">; 2) </w:t>
+            </w:r>
+            <w:r>
+              <w:rPr>
+                <w:rFonts w:ascii="Consolas" w:hAnsi="Consolas"/>
+                <w:sz w:val="20"/>
+              </w:rPr>
+              <w:t>для теста ИИ (1)/ПР-03-00-12 Несоответствующая продукция.doc</w:t>
+            </w:r>
+            <w:r>
+              <w:t xml:space="preserve">, </w:t>
+            </w:r>
+            <w:r>
+              <w:rPr>
+                <w:b/>
+              </w:rPr>
+              <w:t>72%</w:t>
+            </w:r>
+            <w:r>
+              <w:t xml:space="preserve">; 3) </w:t>
+            </w:r>
+            <w:r>
+              <w:rPr>
+                <w:rFonts w:ascii="Consolas" w:hAnsi="Consolas"/>
+                <w:sz w:val="20"/>
+              </w:rPr>
+              <w:t>для теста ИИ (1)/И-08-04-13 Уборка чистой зоны.doc</w:t>
+            </w:r>
+            <w:r>
+              <w:t xml:space="preserve">, </w:t>
+            </w:r>
+            <w:r>
+              <w:rPr>
+                <w:b/>
+              </w:rPr>
+              <w:t>0%</w:t>
+            </w:r>
+            <w:r>
+              <w:t xml:space="preserve"> — </w:t>
+            </w:r>
+            <w:r>
+              <w:rPr>
+                <w:b/>
+              </w:rPr>
+              <w:t>правильный документ снова на последнем месте с 0%</w:t>
+            </w:r>
+          </w:p>
+        </w:tc>
+        <w:tc>
+          <w:tcPr>
+            <w:tcW w:type="dxa" w:w="1728"/>
+          </w:tcPr>
+          <w:p>
+            <w:r>
+              <w:rPr>
+                <w:b/>
+              </w:rPr>
+              <w:t>Не исправлено — паттерн воспроизводится в 4-й раз</w:t>
+            </w:r>
+            <w:r>
+              <w:t xml:space="preserve"> за протокол (после 21:00/21:15, 21:20, 21:22): системная закономерность, не единичный случай</w:t>
+            </w:r>
+          </w:p>
+        </w:tc>
+      </w:tr>
     </w:tbl>
     <w:p>
       <w:pPr>
@@ -3228,6 +3358,58 @@
           <w:p>
             <w:r>
               <w:t>Периодичность для договора подряда не указана; по инструкции оценка персонала проводится по необходимости (выявление потребности в обучении, формирование проектных команд, выявление резервов, увеличение оклада, решение руководителя) — это не устанавливает график для сотрудников по договору подряда. Источник: И-14-00-12 «Оценка персонала», п. 5.3.</w:t>
+            </w:r>
+          </w:p>
+        </w:tc>
+        <w:tc>
+          <w:tcPr>
+            <w:tcW w:type="dxa" w:w="1728"/>
+          </w:tcPr>
+          <w:p>
+            <w:r>
+              <w:t>Не зафиксирована на скриншоте</w:t>
+            </w:r>
+          </w:p>
+        </w:tc>
+      </w:tr>
+      <w:tr>
+        <w:tc>
+          <w:tcPr>
+            <w:tcW w:type="dxa" w:w="1728"/>
+          </w:tcPr>
+          <w:p>
+            <w:r>
+              <w:t>20</w:t>
+            </w:r>
+          </w:p>
+        </w:tc>
+        <w:tc>
+          <w:tcPr>
+            <w:tcW w:type="dxa" w:w="1728"/>
+          </w:tcPr>
+          <w:p>
+            <w:r>
+              <w:t>21:24</w:t>
+            </w:r>
+          </w:p>
+        </w:tc>
+        <w:tc>
+          <w:tcPr>
+            <w:tcW w:type="dxa" w:w="1728"/>
+          </w:tcPr>
+          <w:p>
+            <w:r>
+              <w:t>Какие поля должны быть заполнены в журнале «Учёт уборки производственного оборудования» Форма 17-08?</w:t>
+            </w:r>
+          </w:p>
+        </w:tc>
+        <w:tc>
+          <w:tcPr>
+            <w:tcW w:type="dxa" w:w="1728"/>
+          </w:tcPr>
+          <w:p>
+            <w:r>
+              <w:t>Перечень полей Формы 17-08 не приведён; указано только, что Форма 17-08 — чек-лист проверки ППУ и обхода санитарного состояния производства, контроль уборочного инвентаря — еженедельно ответственным сотрудником ПО. Источник: И-08-04-13 «Уборка чистой зоны», п. 4.4.</w:t>
             </w:r>
           </w:p>
         </w:tc>

</xml_diff>

<commit_message>
Log 21:25 fix-verification: new Находка-2 variant — missing card for cited source
Text cites two sources (ПР-03-00-12, Д-08-07-01); only one card shown, Д-08-07-01 has no card at all despite being directly cited.

Co-Authored-By: Claude Sonnet 5 <noreply@anthropic.com>
Claude-Session: https://claude.ai/code/session_01DpSN8JwCJ3tg3JVUadr2zE
</commit_message>
<xml_diff>
--- a/docs/accounts/eco/pilot-test-04-fix-verification.docx
+++ b/docs/accounts/eco/pilot-test-04-fix-verification.docx
@@ -2243,6 +2243,116 @@
           </w:p>
         </w:tc>
       </w:tr>
+      <w:tr>
+        <w:tc>
+          <w:tcPr>
+            <w:tcW w:type="dxa" w:w="1728"/>
+          </w:tcPr>
+          <w:p>
+            <w:r>
+              <w:t>21:25</w:t>
+            </w:r>
+          </w:p>
+        </w:tc>
+        <w:tc>
+          <w:tcPr>
+            <w:tcW w:type="dxa" w:w="1728"/>
+          </w:tcPr>
+          <w:p>
+            <w:r>
+              <w:t>Новый вопрос («Я технолог производства. Необходимое сырьё находится на складе «Проверка ОКК». Как мне его получить?»)</w:t>
+            </w:r>
+          </w:p>
+        </w:tc>
+        <w:tc>
+          <w:tcPr>
+            <w:tcW w:type="dxa" w:w="1728"/>
+          </w:tcPr>
+          <w:p>
+            <w:r>
+              <w:t>Агент/скоуп не видны на скриншоте</w:t>
+            </w:r>
+          </w:p>
+        </w:tc>
+        <w:tc>
+          <w:tcPr>
+            <w:tcW w:type="dxa" w:w="1728"/>
+          </w:tcPr>
+          <w:p>
+            <w:r>
+              <w:t xml:space="preserve">Подробный ответ: сырьё со склада «Проверка ОКК» нельзя получить в производство до решения ОКК о соответствии и разрешении на применение; входной контроль — на складе сырья СО и в ОКК; решение о соответствии — руководитель ОКК/директор по качеству; решение о применении — руководитель/директор по качеству; результаты — журнал «Контроль сырья и индивидуальной упаковки» (Форма 09-01) или акт при несоответствии; после разрешения — сырьё получают в общем порядке (флажок «Передать сырьё», «Выгрузить WMS» в 1С, при отсутствии отметки — связь с сотрудником СО). Источники в тексте — </w:t>
+            </w:r>
+            <w:r>
+              <w:rPr>
+                <w:b/>
+              </w:rPr>
+              <w:t>два</w:t>
+            </w:r>
+            <w:r>
+              <w:t xml:space="preserve">: ПР-03-00-12 «Несоответствующая продукция» и </w:t>
+            </w:r>
+            <w:r>
+              <w:rPr>
+                <w:b/>
+              </w:rPr>
+              <w:t>Д-08-07-01</w:t>
+            </w:r>
+            <w:r>
+              <w:t xml:space="preserve"> «Порядок получения ТМЦ...». Карточка показана только </w:t>
+            </w:r>
+            <w:r>
+              <w:rPr>
+                <w:b/>
+              </w:rPr>
+              <w:t>одна</w:t>
+            </w:r>
+            <w:r>
+              <w:t xml:space="preserve">: </w:t>
+            </w:r>
+            <w:r>
+              <w:rPr>
+                <w:rFonts w:ascii="Consolas" w:hAnsi="Consolas"/>
+                <w:sz w:val="20"/>
+              </w:rPr>
+              <w:t>для теста ИИ (1)/ПР-03-00-12 Несоответствующая продукция.doc</w:t>
+            </w:r>
+            <w:r>
+              <w:t xml:space="preserve">, 65% — </w:t>
+            </w:r>
+            <w:r>
+              <w:rPr>
+                <w:b/>
+              </w:rPr>
+              <w:t>для Д-08-07-01, второго процитированного источника, карточки нет вообще</w:t>
+            </w:r>
+          </w:p>
+        </w:tc>
+        <w:tc>
+          <w:tcPr>
+            <w:tcW w:type="dxa" w:w="1728"/>
+          </w:tcPr>
+          <w:p>
+            <w:r>
+              <w:rPr>
+                <w:b/>
+              </w:rPr>
+              <w:t>Не исправлено — новый вариант Находки 2.</w:t>
+            </w:r>
+            <w:r>
+              <w:t xml:space="preserve"> Не «неверная карточка», а </w:t>
+            </w:r>
+            <w:r>
+              <w:rPr>
+                <w:b/>
+              </w:rPr>
+              <w:t>отсутствующая карточка</w:t>
+            </w:r>
+            <w:r>
+              <w:t xml:space="preserve"> для одного из двух реально процитированных источников</w:t>
+            </w:r>
+          </w:p>
+        </w:tc>
+      </w:tr>
     </w:tbl>
     <w:p>
       <w:pPr>
@@ -3410,6 +3520,58 @@
           <w:p>
             <w:r>
               <w:t>Перечень полей Формы 17-08 не приведён; указано только, что Форма 17-08 — чек-лист проверки ППУ и обхода санитарного состояния производства, контроль уборочного инвентаря — еженедельно ответственным сотрудником ПО. Источник: И-08-04-13 «Уборка чистой зоны», п. 4.4.</w:t>
+            </w:r>
+          </w:p>
+        </w:tc>
+        <w:tc>
+          <w:tcPr>
+            <w:tcW w:type="dxa" w:w="1728"/>
+          </w:tcPr>
+          <w:p>
+            <w:r>
+              <w:t>Не зафиксирована на скриншоте</w:t>
+            </w:r>
+          </w:p>
+        </w:tc>
+      </w:tr>
+      <w:tr>
+        <w:tc>
+          <w:tcPr>
+            <w:tcW w:type="dxa" w:w="1728"/>
+          </w:tcPr>
+          <w:p>
+            <w:r>
+              <w:t>21</w:t>
+            </w:r>
+          </w:p>
+        </w:tc>
+        <w:tc>
+          <w:tcPr>
+            <w:tcW w:type="dxa" w:w="1728"/>
+          </w:tcPr>
+          <w:p>
+            <w:r>
+              <w:t>21:25</w:t>
+            </w:r>
+          </w:p>
+        </w:tc>
+        <w:tc>
+          <w:tcPr>
+            <w:tcW w:type="dxa" w:w="1728"/>
+          </w:tcPr>
+          <w:p>
+            <w:r>
+              <w:t>Я технолог производства. Необходимое сырьё находится на складе «Проверка ОКК». Как мне его получить?</w:t>
+            </w:r>
+          </w:p>
+        </w:tc>
+        <w:tc>
+          <w:tcPr>
+            <w:tcW w:type="dxa" w:w="1728"/>
+          </w:tcPr>
+          <w:p>
+            <w:r>
+              <w:t>Сырьё со склада «Проверка ОКК» нельзя получить в производство до решения ОКК о соответствии и разрешении на применение; входной контроль на складе сырья СО и в ОКК; решение о соответствии — руководитель ОКК/директор по качеству; результаты — журнал «Контроль сырья и индивидуальной упаковки» (Форма 09-01) или акт; после разрешения — получение в общем порядке через 1С («Передать сырьё», «Выгрузить WMS»). Источники: ПР-03-00-12 «Несоответствующая продукция»; Д-08-07-01 «Порядок получения ТМЦ...».</w:t>
             </w:r>
           </w:p>
         </w:tc>

</xml_diff>

<commit_message>
Log 21:26 fix-verification: repair-priority question (5.2), card clean
Matches demo scenario's documented baseline answer for this question.

Co-Authored-By: Claude Sonnet 5 <noreply@anthropic.com>
Claude-Session: https://claude.ai/code/session_01DpSN8JwCJ3tg3JVUadr2zE
</commit_message>
<xml_diff>
--- a/docs/accounts/eco/pilot-test-04-fix-verification.docx
+++ b/docs/accounts/eco/pilot-test-04-fix-verification.docx
@@ -2353,6 +2353,92 @@
           </w:p>
         </w:tc>
       </w:tr>
+      <w:tr>
+        <w:tc>
+          <w:tcPr>
+            <w:tcW w:type="dxa" w:w="1728"/>
+          </w:tcPr>
+          <w:p>
+            <w:r>
+              <w:t>21:26</w:t>
+            </w:r>
+          </w:p>
+        </w:tc>
+        <w:tc>
+          <w:tcPr>
+            <w:tcW w:type="dxa" w:w="1728"/>
+          </w:tcPr>
+          <w:p>
+            <w:r>
+              <w:t>Вопрос 5.2 («Я механик. Пришло несколько заявок на срочный ремонт. Как понять, какую делать первой?») — используется в demo-сценарии</w:t>
+            </w:r>
+          </w:p>
+        </w:tc>
+        <w:tc>
+          <w:tcPr>
+            <w:tcW w:type="dxa" w:w="1728"/>
+          </w:tcPr>
+          <w:p>
+            <w:r>
+              <w:t>Агент/скоуп не видны на скриншоте</w:t>
+            </w:r>
+          </w:p>
+        </w:tc>
+        <w:tc>
+          <w:tcPr>
+            <w:tcW w:type="dxa" w:w="1728"/>
+          </w:tcPr>
+          <w:p>
+            <w:r>
+              <w:t xml:space="preserve">В первую очередь выполняется заявка, способная повлиять на безопасность выпускаемой продукции; приоритетность определяет </w:t>
+            </w:r>
+            <w:r>
+              <w:rPr>
+                <w:b/>
+              </w:rPr>
+              <w:t>начальник ПУ и/или Мастер ПО</w:t>
+            </w:r>
+            <w:r>
+              <w:t xml:space="preserve">; заявки выполняет сотрудник РМС, назначенный Старшим механиком; в аварийной ситуации заявка может быть получена устно от Технического директора, мастера ПО, начальника ПУ, Главного инженера. Источник в тексте — </w:t>
+            </w:r>
+            <w:r>
+              <w:rPr>
+                <w:b/>
+              </w:rPr>
+              <w:t>ПР-10(02)-00</w:t>
+            </w:r>
+            <w:r>
+              <w:t xml:space="preserve"> «Ремонтно-механическая служба», score 0.4079, с точной цитатой. Карточка: </w:t>
+            </w:r>
+            <w:r>
+              <w:rPr>
+                <w:rFonts w:ascii="Consolas" w:hAnsi="Consolas"/>
+                <w:sz w:val="20"/>
+              </w:rPr>
+              <w:t>для теста ИИ (1)/ПР-10(02)-00 Ремонтно-механическая служба.docx</w:t>
+            </w:r>
+            <w:r>
+              <w:t xml:space="preserve">, 48% — </w:t>
+            </w:r>
+            <w:r>
+              <w:rPr>
+                <w:b/>
+              </w:rPr>
+              <w:t>совпадает с текстом, Находка 2 не проявилась</w:t>
+            </w:r>
+          </w:p>
+        </w:tc>
+        <w:tc>
+          <w:tcPr>
+            <w:tcW w:type="dxa" w:w="1728"/>
+          </w:tcPr>
+          <w:p>
+            <w:r>
+              <w:t>Чисто — карточка/текст согласованы; ответ по содержанию совпадает с зафиксированным ранее (демо-сценарий, 19:14)</w:t>
+            </w:r>
+          </w:p>
+        </w:tc>
+      </w:tr>
     </w:tbl>
     <w:p>
       <w:pPr>
@@ -3572,6 +3658,58 @@
           <w:p>
             <w:r>
               <w:t>Сырьё со склада «Проверка ОКК» нельзя получить в производство до решения ОКК о соответствии и разрешении на применение; входной контроль на складе сырья СО и в ОКК; решение о соответствии — руководитель ОКК/директор по качеству; результаты — журнал «Контроль сырья и индивидуальной упаковки» (Форма 09-01) или акт; после разрешения — получение в общем порядке через 1С («Передать сырьё», «Выгрузить WMS»). Источники: ПР-03-00-12 «Несоответствующая продукция»; Д-08-07-01 «Порядок получения ТМЦ...».</w:t>
+            </w:r>
+          </w:p>
+        </w:tc>
+        <w:tc>
+          <w:tcPr>
+            <w:tcW w:type="dxa" w:w="1728"/>
+          </w:tcPr>
+          <w:p>
+            <w:r>
+              <w:t>Не зафиксирована на скриншоте</w:t>
+            </w:r>
+          </w:p>
+        </w:tc>
+      </w:tr>
+      <w:tr>
+        <w:tc>
+          <w:tcPr>
+            <w:tcW w:type="dxa" w:w="1728"/>
+          </w:tcPr>
+          <w:p>
+            <w:r>
+              <w:t>22</w:t>
+            </w:r>
+          </w:p>
+        </w:tc>
+        <w:tc>
+          <w:tcPr>
+            <w:tcW w:type="dxa" w:w="1728"/>
+          </w:tcPr>
+          <w:p>
+            <w:r>
+              <w:t>21:26</w:t>
+            </w:r>
+          </w:p>
+        </w:tc>
+        <w:tc>
+          <w:tcPr>
+            <w:tcW w:type="dxa" w:w="1728"/>
+          </w:tcPr>
+          <w:p>
+            <w:r>
+              <w:t>Я механик. Пришло несколько заявок на срочный ремонт. Как понять, какую делать первой?</w:t>
+            </w:r>
+          </w:p>
+        </w:tc>
+        <w:tc>
+          <w:tcPr>
+            <w:tcW w:type="dxa" w:w="1728"/>
+          </w:tcPr>
+          <w:p>
+            <w:r>
+              <w:t>В первую очередь — заявка, способная повлиять на безопасность продукции; приоритетность определяет начальник ПУ и/или Мастер ПО; заявки выполняет сотрудник РМС, назначенный Старшим механиком; в аварийной ситуации заявка может быть получена устно от Технического директора, мастера ПО, начальника ПУ, Главного инженера. Источник: ПР-10(02)-00 «Ремонтно-механическая служба», score 0.4079, с цитатой.</w:t>
             </w:r>
           </w:p>
         </w:tc>

</xml_diff>

<commit_message>
Log 21:27 fix-verification: question 5.3 from bug report, pattern confirmed 5th time
Correct doc И-08-08-01 now appears (unlike original bug report where it was absent entirely) but still ranks #2 at 0%, wrong doc И-12-12-06 ranks #1 at 60%.

Co-Authored-By: Claude Sonnet 5 <noreply@anthropic.com>
Claude-Session: https://claude.ai/code/session_01DpSN8JwCJ3tg3JVUadr2zE
</commit_message>
<xml_diff>
--- a/docs/accounts/eco/pilot-test-04-fix-verification.docx
+++ b/docs/accounts/eco/pilot-test-04-fix-verification.docx
@@ -2439,6 +2439,117 @@
           </w:p>
         </w:tc>
       </w:tr>
+      <w:tr>
+        <w:tc>
+          <w:tcPr>
+            <w:tcW w:type="dxa" w:w="1728"/>
+          </w:tcPr>
+          <w:p>
+            <w:r>
+              <w:t>21:27</w:t>
+            </w:r>
+          </w:p>
+        </w:tc>
+        <w:tc>
+          <w:tcPr>
+            <w:tcW w:type="dxa" w:w="1728"/>
+          </w:tcPr>
+          <w:p>
+            <w:r>
+              <w:t>Вопрос 5.3 («Я начальник производства. Нужно сделать запас продукции на склад, но оборудование занято под срочный заказ покупателя. Как поступить?»)</w:t>
+            </w:r>
+          </w:p>
+        </w:tc>
+        <w:tc>
+          <w:tcPr>
+            <w:tcW w:type="dxa" w:w="1728"/>
+          </w:tcPr>
+          <w:p>
+            <w:r>
+              <w:t>Агент/скоуп не видны на скриншоте</w:t>
+            </w:r>
+          </w:p>
+        </w:tc>
+        <w:tc>
+          <w:tcPr>
+            <w:tcW w:type="dxa" w:w="1728"/>
+          </w:tcPr>
+          <w:p>
+            <w:r>
+              <w:t xml:space="preserve">Подробный ответ с цитатами: не освобождать оборудование за счёт срочного заказа покупателя (порядок переноса/отмены не установлен в фрагменте); для планирования запаса — сформировать отчёт «Планирование наработки на склад», проверить отчёт «Загруженность оборудования (по заказам и контрагентам)», определить возможную дату выпуска с учётом занятости оборудования, запланировать наработку на свободное окно либо позже срочного заказа; не указано, кто уполномочен менять приоритет срочного заказа. Источник в тексте — </w:t>
+            </w:r>
+            <w:r>
+              <w:rPr>
+                <w:b/>
+              </w:rPr>
+              <w:t>И-08-08-01</w:t>
+            </w:r>
+            <w:r>
+              <w:t xml:space="preserve"> «Наработка складских позиций». Карточки: 1) </w:t>
+            </w:r>
+            <w:r>
+              <w:rPr>
+                <w:rFonts w:ascii="Consolas" w:hAnsi="Consolas"/>
+                <w:sz w:val="20"/>
+              </w:rPr>
+              <w:t>для теста ИИ (1)/И-12-12-06 Оформление заказа Покупателя в 1С.docx</w:t>
+            </w:r>
+            <w:r>
+              <w:t xml:space="preserve">, </w:t>
+            </w:r>
+            <w:r>
+              <w:rPr>
+                <w:b/>
+              </w:rPr>
+              <w:t>60%</w:t>
+            </w:r>
+            <w:r>
+              <w:t xml:space="preserve">; 2) </w:t>
+            </w:r>
+            <w:r>
+              <w:rPr>
+                <w:rFonts w:ascii="Consolas" w:hAnsi="Consolas"/>
+                <w:sz w:val="20"/>
+              </w:rPr>
+              <w:t>для теста ИИ (1)/И-08-08-01 Наработка складских позиций.docx</w:t>
+            </w:r>
+            <w:r>
+              <w:t xml:space="preserve">, </w:t>
+            </w:r>
+            <w:r>
+              <w:rPr>
+                <w:b/>
+              </w:rPr>
+              <w:t>0%</w:t>
+            </w:r>
+            <w:r>
+              <w:t xml:space="preserve"> — </w:t>
+            </w:r>
+            <w:r>
+              <w:rPr>
+                <w:b/>
+              </w:rPr>
+              <w:t>правильный документ снова 2-м с 0%</w:t>
+            </w:r>
+          </w:p>
+        </w:tc>
+        <w:tc>
+          <w:tcPr>
+            <w:tcW w:type="dxa" w:w="1728"/>
+          </w:tcPr>
+          <w:p>
+            <w:r>
+              <w:rPr>
+                <w:b/>
+              </w:rPr>
+              <w:t>Не исправлено — 5-й раз паттерн, и это тот самый вопрос 5.3 из баг-репорта</w:t>
+            </w:r>
+            <w:r>
+              <w:t xml:space="preserve"> (где раньше карточки были И-12-12-06 и Д-11-06-01, обе неверные — см. Находка 2, таблица evidence). Теперь правильный документ хотя бы появился в списке, но по-прежнему не первым и с 0%</w:t>
+            </w:r>
+          </w:p>
+        </w:tc>
+      </w:tr>
     </w:tbl>
     <w:p>
       <w:pPr>
@@ -3710,6 +3821,58 @@
           <w:p>
             <w:r>
               <w:t>В первую очередь — заявка, способная повлиять на безопасность продукции; приоритетность определяет начальник ПУ и/или Мастер ПО; заявки выполняет сотрудник РМС, назначенный Старшим механиком; в аварийной ситуации заявка может быть получена устно от Технического директора, мастера ПО, начальника ПУ, Главного инженера. Источник: ПР-10(02)-00 «Ремонтно-механическая служба», score 0.4079, с цитатой.</w:t>
+            </w:r>
+          </w:p>
+        </w:tc>
+        <w:tc>
+          <w:tcPr>
+            <w:tcW w:type="dxa" w:w="1728"/>
+          </w:tcPr>
+          <w:p>
+            <w:r>
+              <w:t>Не зафиксирована на скриншоте</w:t>
+            </w:r>
+          </w:p>
+        </w:tc>
+      </w:tr>
+      <w:tr>
+        <w:tc>
+          <w:tcPr>
+            <w:tcW w:type="dxa" w:w="1728"/>
+          </w:tcPr>
+          <w:p>
+            <w:r>
+              <w:t>23</w:t>
+            </w:r>
+          </w:p>
+        </w:tc>
+        <w:tc>
+          <w:tcPr>
+            <w:tcW w:type="dxa" w:w="1728"/>
+          </w:tcPr>
+          <w:p>
+            <w:r>
+              <w:t>21:27</w:t>
+            </w:r>
+          </w:p>
+        </w:tc>
+        <w:tc>
+          <w:tcPr>
+            <w:tcW w:type="dxa" w:w="1728"/>
+          </w:tcPr>
+          <w:p>
+            <w:r>
+              <w:t>Я начальник производства. Нужно сделать запас продукции на склад, но оборудование занято под срочный заказ покупателя. Как поступить?</w:t>
+            </w:r>
+          </w:p>
+        </w:tc>
+        <w:tc>
+          <w:tcPr>
+            <w:tcW w:type="dxa" w:w="1728"/>
+          </w:tcPr>
+          <w:p>
+            <w:r>
+              <w:t>Не освобождать оборудование за счёт срочного заказа покупателя (порядок переноса/отмены не установлен в доступном фрагменте); для планирования запаса — сформировать отчёт «Планирование наработки на склад», проверить отчёт «Загруженность оборудования (по заказам и контрагентам)», определить возможную дату выпуска с учётом занятости оборудования, запланировать наработку на свободное окно либо на дату после срочного заказа; если потребность в запасе передана руководством — учесть при планировании; не указано, кто уполномочен менять приоритет срочного заказа. Источник: И-08-08-01 «Наработка складских позиций».</w:t>
             </w:r>
           </w:p>
         </w:tc>

</xml_diff>

<commit_message>
Log 21:28 fix-verification: fasovka-operator question, both cards clean
Co-Authored-By: Claude Sonnet 5 <noreply@anthropic.com>
Claude-Session: https://claude.ai/code/session_01DpSN8JwCJ3tg3JVUadr2zE
</commit_message>
<xml_diff>
--- a/docs/accounts/eco/pilot-test-04-fix-verification.docx
+++ b/docs/accounts/eco/pilot-test-04-fix-verification.docx
@@ -2550,6 +2550,120 @@
           </w:p>
         </w:tc>
       </w:tr>
+      <w:tr>
+        <w:tc>
+          <w:tcPr>
+            <w:tcW w:type="dxa" w:w="1728"/>
+          </w:tcPr>
+          <w:p>
+            <w:r>
+              <w:t>21:28</w:t>
+            </w:r>
+          </w:p>
+        </w:tc>
+        <w:tc>
+          <w:tcPr>
+            <w:tcW w:type="dxa" w:w="1728"/>
+          </w:tcPr>
+          <w:p>
+            <w:r>
+              <w:t>Новый вопрос («Какие действия оператора по фасовке готовой продукции?»)</w:t>
+            </w:r>
+          </w:p>
+        </w:tc>
+        <w:tc>
+          <w:tcPr>
+            <w:tcW w:type="dxa" w:w="1728"/>
+          </w:tcPr>
+          <w:p>
+            <w:r>
+              <w:t>Агент/скоуп не видны на скриншоте</w:t>
+            </w:r>
+          </w:p>
+        </w:tc>
+        <w:tc>
+          <w:tcPr>
+            <w:tcW w:type="dxa" w:w="1728"/>
+          </w:tcPr>
+          <w:p>
+            <w:r>
+              <w:t xml:space="preserve">Подробный ответ (6 пунктов с подпунктами): убедиться, что продукция допущена к фасовке; проверить в «Рабочей инструкции на производство» (форма 16-03) поля «Примечания к тех. процессу» и «Вид фасовки»; внешний осмотр тары/упаковки; выполнить фасовку по И-08-02 «Фасовка и упаковка готовой продукции»; нанести маркировку (по центру упаковки при наличии этикеток, иначе — маркером с артикулом и партией); разместить на пластиковый паллет серого цвета и обмотать стретч-плёнкой не менее трёх оборотов на ряд; при расхождении фактического количества — уведомление ОКК ответственным сотрудником ПО. Источники в тексте — </w:t>
+            </w:r>
+            <w:r>
+              <w:rPr>
+                <w:b/>
+              </w:rPr>
+              <w:t>И-08-02-10</w:t>
+            </w:r>
+            <w:r>
+              <w:t xml:space="preserve"> «Фасовка и упаковка готовой продукции» (п. 3.1.1–3.1.2, 4.1–4.3, 5.1) и </w:t>
+            </w:r>
+            <w:r>
+              <w:rPr>
+                <w:b/>
+              </w:rPr>
+              <w:t>ПР-08-00-14</w:t>
+            </w:r>
+            <w:r>
+              <w:t xml:space="preserve"> «Производственный процесс» (п. 5.6.3–5.6.4). Карточки: 1) </w:t>
+            </w:r>
+            <w:r>
+              <w:rPr>
+                <w:rFonts w:ascii="Consolas" w:hAnsi="Consolas"/>
+                <w:sz w:val="20"/>
+              </w:rPr>
+              <w:t>для теста ИИ (1)/И-08-02-10 Фасовка и упаковка готовой продукции.doc</w:t>
+            </w:r>
+            <w:r>
+              <w:t xml:space="preserve">, </w:t>
+            </w:r>
+            <w:r>
+              <w:rPr>
+                <w:b/>
+              </w:rPr>
+              <w:t>51%</w:t>
+            </w:r>
+            <w:r>
+              <w:t xml:space="preserve">; 2) </w:t>
+            </w:r>
+            <w:r>
+              <w:rPr>
+                <w:rFonts w:ascii="Consolas" w:hAnsi="Consolas"/>
+                <w:sz w:val="20"/>
+              </w:rPr>
+              <w:t>для теста ИИ (1)/ПР-08-00-14 Производственный процесс.doc</w:t>
+            </w:r>
+            <w:r>
+              <w:t xml:space="preserve">, </w:t>
+            </w:r>
+            <w:r>
+              <w:rPr>
+                <w:b/>
+              </w:rPr>
+              <w:t>51%</w:t>
+            </w:r>
+            <w:r>
+              <w:t xml:space="preserve"> — </w:t>
+            </w:r>
+            <w:r>
+              <w:rPr>
+                <w:b/>
+              </w:rPr>
+              <w:t>обе совпадают с текстом, Находка 2 не проявилась</w:t>
+            </w:r>
+          </w:p>
+        </w:tc>
+        <w:tc>
+          <w:tcPr>
+            <w:tcW w:type="dxa" w:w="1728"/>
+          </w:tcPr>
+          <w:p>
+            <w:r>
+              <w:t>Чисто — оба источника совпадают с текстом</w:t>
+            </w:r>
+          </w:p>
+        </w:tc>
+      </w:tr>
     </w:tbl>
     <w:p>
       <w:pPr>
@@ -3873,6 +3987,58 @@
           <w:p>
             <w:r>
               <w:t>Не освобождать оборудование за счёт срочного заказа покупателя (порядок переноса/отмены не установлен в доступном фрагменте); для планирования запаса — сформировать отчёт «Планирование наработки на склад», проверить отчёт «Загруженность оборудования (по заказам и контрагентам)», определить возможную дату выпуска с учётом занятости оборудования, запланировать наработку на свободное окно либо на дату после срочного заказа; если потребность в запасе передана руководством — учесть при планировании; не указано, кто уполномочен менять приоритет срочного заказа. Источник: И-08-08-01 «Наработка складских позиций».</w:t>
+            </w:r>
+          </w:p>
+        </w:tc>
+        <w:tc>
+          <w:tcPr>
+            <w:tcW w:type="dxa" w:w="1728"/>
+          </w:tcPr>
+          <w:p>
+            <w:r>
+              <w:t>Не зафиксирована на скриншоте</w:t>
+            </w:r>
+          </w:p>
+        </w:tc>
+      </w:tr>
+      <w:tr>
+        <w:tc>
+          <w:tcPr>
+            <w:tcW w:type="dxa" w:w="1728"/>
+          </w:tcPr>
+          <w:p>
+            <w:r>
+              <w:t>24</w:t>
+            </w:r>
+          </w:p>
+        </w:tc>
+        <w:tc>
+          <w:tcPr>
+            <w:tcW w:type="dxa" w:w="1728"/>
+          </w:tcPr>
+          <w:p>
+            <w:r>
+              <w:t>21:28</w:t>
+            </w:r>
+          </w:p>
+        </w:tc>
+        <w:tc>
+          <w:tcPr>
+            <w:tcW w:type="dxa" w:w="1728"/>
+          </w:tcPr>
+          <w:p>
+            <w:r>
+              <w:t>Какие действия оператора по фасовке готовой продукции?</w:t>
+            </w:r>
+          </w:p>
+        </w:tc>
+        <w:tc>
+          <w:tcPr>
+            <w:tcW w:type="dxa" w:w="1728"/>
+          </w:tcPr>
+          <w:p>
+            <w:r>
+              <w:t>Убедиться, что продукция допущена к фасовке; проверить в «Рабочей инструкции на производство» (форма 16-03) поля «Примечания к тех. процессу» и «Вид фасовки»; внешний осмотр тары/упаковки; выполнить фасовку по И-08-02; нанести маркировку (по центру упаковки при наличии этикеток, иначе маркером с артикулом и партией); разместить на пластиковый паллет серого цвета, обмотать стретч-плёнкой не менее трёх оборотов на ряд; при расхождении фактического количества — уведомление ОКК. Источники: И-08-02-10 «Фасовка и упаковка готовой продукции»; ПР-08-00-14 «Производственный процесс».</w:t>
             </w:r>
           </w:p>
         </w:tc>

</xml_diff>

<commit_message>
Log 21:29 fix-verification: question 6.2, card clean but content differs from Находка-3 expectation
Card matches text (Д-08-03-01) — no Находка 2 here. But answer content differs from the earlier ЭКО_2-reconverted result for this question; scope not visible on screenshot, may be running against original eco collection.

Co-Authored-By: Claude Sonnet 5 <noreply@anthropic.com>
Claude-Session: https://claude.ai/code/session_01DpSN8JwCJ3tg3JVUadr2zE
</commit_message>
<xml_diff>
--- a/docs/accounts/eco/pilot-test-04-fix-verification.docx
+++ b/docs/accounts/eco/pilot-test-04-fix-verification.docx
@@ -2664,6 +2664,131 @@
           </w:p>
         </w:tc>
       </w:tr>
+      <w:tr>
+        <w:tc>
+          <w:tcPr>
+            <w:tcW w:type="dxa" w:w="1728"/>
+          </w:tcPr>
+          <w:p>
+            <w:r>
+              <w:t>21:29</w:t>
+            </w:r>
+          </w:p>
+        </w:tc>
+        <w:tc>
+          <w:tcPr>
+            <w:tcW w:type="dxa" w:w="1728"/>
+          </w:tcPr>
+          <w:p>
+            <w:r>
+              <w:t>Вопрос 6.2 («Как добавить новую Спецификацию в 1С-8?») — второй из документов Находки 3 (n=3/3 исправленных через переконвертацию)</w:t>
+            </w:r>
+          </w:p>
+        </w:tc>
+        <w:tc>
+          <w:tcPr>
+            <w:tcW w:type="dxa" w:w="1728"/>
+          </w:tcPr>
+          <w:p>
+            <w:r>
+              <w:t>Агент/скоуп не видны на скриншоте</w:t>
+            </w:r>
+          </w:p>
+        </w:tc>
+        <w:tc>
+          <w:tcPr>
+            <w:tcW w:type="dxa" w:w="1728"/>
+          </w:tcPr>
+          <w:p>
+            <w:r>
+              <w:t xml:space="preserve">Ответ описывает процесс при </w:t>
+            </w:r>
+            <w:r>
+              <w:rPr>
+                <w:b/>
+              </w:rPr>
+              <w:t>отсутствии утверждённой спецификации</w:t>
+            </w:r>
+            <w:r>
+              <w:t xml:space="preserve">: направить запрос по email ведущему технологу ПО, в копию — технический директор и начальник ПО; ведущий технолог ПО в течение 1 раб. дня вносит спецификации согласно И-08-05 «Внесение спецификаций в базе 1С8». Явно отмечено: «Подробный порядок самостоятельного добавления новой спецификации в 1С-8 в доступном фрагменте не приведён». Источник в тексте — </w:t>
+            </w:r>
+            <w:r>
+              <w:rPr>
+                <w:b/>
+              </w:rPr>
+              <w:t>Д-08-03-01</w:t>
+            </w:r>
+            <w:r>
+              <w:t xml:space="preserve"> «Формирование заказов на производство в базе 1С-8», п. 3.6. Карточка: </w:t>
+            </w:r>
+            <w:r>
+              <w:rPr>
+                <w:rFonts w:ascii="Consolas" w:hAnsi="Consolas"/>
+                <w:sz w:val="20"/>
+              </w:rPr>
+              <w:t>для теста ИИ (1)/Д-08-03-01 Формирование заказов на производство в базе 1С-8.doc</w:t>
+            </w:r>
+            <w:r>
+              <w:t xml:space="preserve">, 65% — </w:t>
+            </w:r>
+            <w:r>
+              <w:rPr>
+                <w:b/>
+              </w:rPr>
+              <w:t>совпадает с текстом, Находка 2 не проявилась</w:t>
+            </w:r>
+          </w:p>
+        </w:tc>
+        <w:tc>
+          <w:tcPr>
+            <w:tcW w:type="dxa" w:w="1728"/>
+          </w:tcPr>
+          <w:p>
+            <w:r>
+              <w:t xml:space="preserve">Чисто по карточке, но </w:t>
+            </w:r>
+            <w:r>
+              <w:rPr>
+                <w:b/>
+              </w:rPr>
+              <w:t>иной результат, чем ожидался по Находке 3</w:t>
+            </w:r>
+            <w:r>
+              <w:t xml:space="preserve">: там прямой ответ давал именно переконвертированный файл </w:t>
+            </w:r>
+            <w:r>
+              <w:rPr>
+                <w:rFonts w:ascii="Consolas" w:hAnsi="Consolas"/>
+                <w:sz w:val="20"/>
+              </w:rPr>
+              <w:t>instrukciya-08-05-08.docx</w:t>
+            </w:r>
+            <w:r>
+              <w:t xml:space="preserve"> на </w:t>
+            </w:r>
+            <w:r>
+              <w:rPr>
+                <w:rFonts w:ascii="Consolas" w:hAnsi="Consolas"/>
+                <w:sz w:val="20"/>
+              </w:rPr>
+              <w:t>ЭКО_2</w:t>
+            </w:r>
+            <w:r>
+              <w:t xml:space="preserve">; здесь ссылается на другой документ (Д-08-03-01) и честно не находит порядка самостоятельного добавления — возможно, тест идёт не на </w:t>
+            </w:r>
+            <w:r>
+              <w:rPr>
+                <w:rFonts w:ascii="Consolas" w:hAnsi="Consolas"/>
+                <w:sz w:val="20"/>
+              </w:rPr>
+              <w:t>ЭКО_2</w:t>
+            </w:r>
+            <w:r>
+              <w:t>, скоуп не зафиксирован</w:t>
+            </w:r>
+          </w:p>
+        </w:tc>
+      </w:tr>
     </w:tbl>
     <w:p>
       <w:pPr>
@@ -4039,6 +4164,58 @@
           <w:p>
             <w:r>
               <w:t>Убедиться, что продукция допущена к фасовке; проверить в «Рабочей инструкции на производство» (форма 16-03) поля «Примечания к тех. процессу» и «Вид фасовки»; внешний осмотр тары/упаковки; выполнить фасовку по И-08-02; нанести маркировку (по центру упаковки при наличии этикеток, иначе маркером с артикулом и партией); разместить на пластиковый паллет серого цвета, обмотать стретч-плёнкой не менее трёх оборотов на ряд; при расхождении фактического количества — уведомление ОКК. Источники: И-08-02-10 «Фасовка и упаковка готовой продукции»; ПР-08-00-14 «Производственный процесс».</w:t>
+            </w:r>
+          </w:p>
+        </w:tc>
+        <w:tc>
+          <w:tcPr>
+            <w:tcW w:type="dxa" w:w="1728"/>
+          </w:tcPr>
+          <w:p>
+            <w:r>
+              <w:t>Не зафиксирована на скриншоте</w:t>
+            </w:r>
+          </w:p>
+        </w:tc>
+      </w:tr>
+      <w:tr>
+        <w:tc>
+          <w:tcPr>
+            <w:tcW w:type="dxa" w:w="1728"/>
+          </w:tcPr>
+          <w:p>
+            <w:r>
+              <w:t>25</w:t>
+            </w:r>
+          </w:p>
+        </w:tc>
+        <w:tc>
+          <w:tcPr>
+            <w:tcW w:type="dxa" w:w="1728"/>
+          </w:tcPr>
+          <w:p>
+            <w:r>
+              <w:t>21:29</w:t>
+            </w:r>
+          </w:p>
+        </w:tc>
+        <w:tc>
+          <w:tcPr>
+            <w:tcW w:type="dxa" w:w="1728"/>
+          </w:tcPr>
+          <w:p>
+            <w:r>
+              <w:t>Как добавить новую Спецификацию в 1С-8?</w:t>
+            </w:r>
+          </w:p>
+        </w:tc>
+        <w:tc>
+          <w:tcPr>
+            <w:tcW w:type="dxa" w:w="1728"/>
+          </w:tcPr>
+          <w:p>
+            <w:r>
+              <w:t>При отсутствии утверждённой спецификации: запрос по email ведущему технологу ПО, в копию — технический директор и начальник ПО; ведущий технолог ПО в течение 1 раб. дня вносит спецификации согласно И-08-05. Подробный порядок самостоятельного добавления новой спецификации в доступном фрагменте не приведён. Источник: Д-08-03-01 «Формирование заказов на производство в базе 1С-8», п. 3.6.</w:t>
             </w:r>
           </w:p>
         </w:tc>

</xml_diff>

<commit_message>
Confirm collection scope (ЭКО) throughout + log 21:30: glossary reappears off-2.3
User confirmed the entire fix-verification session runs on collection ЭКО (not ЭКО_2), retroactively updating all "scope not visible" notes and resolving the 21:29 content-mismatch question. New 21:30 result: "глоссарий"/100% reproduces on a brand-new question (входной контроль сырья), correct doc ПР-03-00-12 again ranks #2 at 0% — 6th глоссарий sighting overall, first one outside question 2.3.

Co-Authored-By: Claude Sonnet 5 <noreply@anthropic.com>
Claude-Session: https://claude.ai/code/session_01DpSN8JwCJ3tg3JVUadr2zE
</commit_message>
<xml_diff>
--- a/docs/accounts/eco/pilot-test-04-fix-verification.docx
+++ b/docs/accounts/eco/pilot-test-04-fix-verification.docx
@@ -445,7 +445,14 @@
           </w:tcPr>
           <w:p>
             <w:r>
-              <w:t>Агент/скоуп не видны на скриншоте (не зафиксированы)</w:t>
+              <w:rPr>
+                <w:rFonts w:ascii="Consolas" w:hAnsi="Consolas"/>
+                <w:sz w:val="20"/>
+              </w:rPr>
+              <w:t>ЭКО</w:t>
+            </w:r>
+            <w:r>
+              <w:t xml:space="preserve"> (уточнено пользователем в чате: «у нас тест по ЭКО»; на скриншотах попап «Где искать» не открыт)</w:t>
             </w:r>
           </w:p>
         </w:tc>
@@ -538,7 +545,14 @@
           </w:tcPr>
           <w:p>
             <w:r>
-              <w:t>Агент/скоуп не видны на скриншоте</w:t>
+              <w:rPr>
+                <w:rFonts w:ascii="Consolas" w:hAnsi="Consolas"/>
+                <w:sz w:val="20"/>
+              </w:rPr>
+              <w:t>ЭКО</w:t>
+            </w:r>
+            <w:r>
+              <w:t xml:space="preserve"> (уточнено пользователем)</w:t>
             </w:r>
           </w:p>
         </w:tc>
@@ -623,7 +637,14 @@
           </w:tcPr>
           <w:p>
             <w:r>
-              <w:t>Агент/скоуп не видны на скриншоте</w:t>
+              <w:rPr>
+                <w:rFonts w:ascii="Consolas" w:hAnsi="Consolas"/>
+                <w:sz w:val="20"/>
+              </w:rPr>
+              <w:t>ЭКО</w:t>
+            </w:r>
+            <w:r>
+              <w:t xml:space="preserve"> (уточнено пользователем)</w:t>
             </w:r>
           </w:p>
         </w:tc>
@@ -714,7 +735,14 @@
           </w:tcPr>
           <w:p>
             <w:r>
-              <w:t>Агент/скоуп не видны на скриншоте</w:t>
+              <w:rPr>
+                <w:rFonts w:ascii="Consolas" w:hAnsi="Consolas"/>
+                <w:sz w:val="20"/>
+              </w:rPr>
+              <w:t>ЭКО</w:t>
+            </w:r>
+            <w:r>
+              <w:t xml:space="preserve"> (уточнено пользователем)</w:t>
             </w:r>
           </w:p>
         </w:tc>
@@ -827,7 +855,14 @@
           </w:tcPr>
           <w:p>
             <w:r>
-              <w:t>Агент/скоуп не видны на скриншоте</w:t>
+              <w:rPr>
+                <w:rFonts w:ascii="Consolas" w:hAnsi="Consolas"/>
+                <w:sz w:val="20"/>
+              </w:rPr>
+              <w:t>ЭКО</w:t>
+            </w:r>
+            <w:r>
+              <w:t xml:space="preserve"> (уточнено пользователем)</w:t>
             </w:r>
           </w:p>
         </w:tc>
@@ -931,7 +966,14 @@
           </w:tcPr>
           <w:p>
             <w:r>
-              <w:t>Агент/скоуп не видны на скриншоте</w:t>
+              <w:rPr>
+                <w:rFonts w:ascii="Consolas" w:hAnsi="Consolas"/>
+                <w:sz w:val="20"/>
+              </w:rPr>
+              <w:t>ЭКО</w:t>
+            </w:r>
+            <w:r>
+              <w:t xml:space="preserve"> (уточнено пользователем)</w:t>
             </w:r>
           </w:p>
         </w:tc>
@@ -1051,7 +1093,14 @@
           </w:tcPr>
           <w:p>
             <w:r>
-              <w:t>Агент/скоуп не видны на скриншоте</w:t>
+              <w:rPr>
+                <w:rFonts w:ascii="Consolas" w:hAnsi="Consolas"/>
+                <w:sz w:val="20"/>
+              </w:rPr>
+              <w:t>ЭКО</w:t>
+            </w:r>
+            <w:r>
+              <w:t xml:space="preserve"> (уточнено пользователем)</w:t>
             </w:r>
           </w:p>
         </w:tc>
@@ -1128,7 +1177,14 @@
           </w:tcPr>
           <w:p>
             <w:r>
-              <w:t>Агент/скоуп не видны на скриншоте</w:t>
+              <w:rPr>
+                <w:rFonts w:ascii="Consolas" w:hAnsi="Consolas"/>
+                <w:sz w:val="20"/>
+              </w:rPr>
+              <w:t>ЭКО</w:t>
+            </w:r>
+            <w:r>
+              <w:t xml:space="preserve"> (уточнено пользователем)</w:t>
             </w:r>
           </w:p>
         </w:tc>
@@ -1204,7 +1260,14 @@
           </w:tcPr>
           <w:p>
             <w:r>
-              <w:t>Агент/скоуп не видны на скриншоте</w:t>
+              <w:rPr>
+                <w:rFonts w:ascii="Consolas" w:hAnsi="Consolas"/>
+                <w:sz w:val="20"/>
+              </w:rPr>
+              <w:t>ЭКО</w:t>
+            </w:r>
+            <w:r>
+              <w:t xml:space="preserve"> (уточнено пользователем)</w:t>
             </w:r>
           </w:p>
         </w:tc>
@@ -1318,7 +1381,14 @@
           </w:tcPr>
           <w:p>
             <w:r>
-              <w:t>Агент/скоуп не видны на скриншоте</w:t>
+              <w:rPr>
+                <w:rFonts w:ascii="Consolas" w:hAnsi="Consolas"/>
+                <w:sz w:val="20"/>
+              </w:rPr>
+              <w:t>ЭКО</w:t>
+            </w:r>
+            <w:r>
+              <w:t xml:space="preserve"> (уточнено пользователем)</w:t>
             </w:r>
           </w:p>
         </w:tc>
@@ -1429,7 +1499,14 @@
           </w:tcPr>
           <w:p>
             <w:r>
-              <w:t>Агент/скоуп не видны на скриншоте</w:t>
+              <w:rPr>
+                <w:rFonts w:ascii="Consolas" w:hAnsi="Consolas"/>
+                <w:sz w:val="20"/>
+              </w:rPr>
+              <w:t>ЭКО</w:t>
+            </w:r>
+            <w:r>
+              <w:t xml:space="preserve"> (уточнено пользователем)</w:t>
             </w:r>
           </w:p>
         </w:tc>
@@ -1506,7 +1583,14 @@
           </w:tcPr>
           <w:p>
             <w:r>
-              <w:t>Агент/скоуп не видны на скриншоте</w:t>
+              <w:rPr>
+                <w:rFonts w:ascii="Consolas" w:hAnsi="Consolas"/>
+                <w:sz w:val="20"/>
+              </w:rPr>
+              <w:t>ЭКО</w:t>
+            </w:r>
+            <w:r>
+              <w:t xml:space="preserve"> (уточнено пользователем)</w:t>
             </w:r>
           </w:p>
         </w:tc>
@@ -1583,7 +1667,14 @@
           </w:tcPr>
           <w:p>
             <w:r>
-              <w:t>Агент/скоуп не видны на скриншоте</w:t>
+              <w:rPr>
+                <w:rFonts w:ascii="Consolas" w:hAnsi="Consolas"/>
+                <w:sz w:val="20"/>
+              </w:rPr>
+              <w:t>ЭКО</w:t>
+            </w:r>
+            <w:r>
+              <w:t xml:space="preserve"> (уточнено пользователем)</w:t>
             </w:r>
           </w:p>
         </w:tc>
@@ -1660,7 +1751,14 @@
           </w:tcPr>
           <w:p>
             <w:r>
-              <w:t>Агент/скоуп не видны на скриншоте</w:t>
+              <w:rPr>
+                <w:rFonts w:ascii="Consolas" w:hAnsi="Consolas"/>
+                <w:sz w:val="20"/>
+              </w:rPr>
+              <w:t>ЭКО</w:t>
+            </w:r>
+            <w:r>
+              <w:t xml:space="preserve"> (уточнено пользователем)</w:t>
             </w:r>
           </w:p>
         </w:tc>
@@ -1756,7 +1854,14 @@
           </w:tcPr>
           <w:p>
             <w:r>
-              <w:t>Агент/скоуп не видны на скриншоте</w:t>
+              <w:rPr>
+                <w:rFonts w:ascii="Consolas" w:hAnsi="Consolas"/>
+                <w:sz w:val="20"/>
+              </w:rPr>
+              <w:t>ЭКО</w:t>
+            </w:r>
+            <w:r>
+              <w:t xml:space="preserve"> (уточнено пользователем)</w:t>
             </w:r>
           </w:p>
         </w:tc>
@@ -1818,7 +1923,14 @@
           </w:tcPr>
           <w:p>
             <w:r>
-              <w:t>Агент/скоуп не видны на скриншоте</w:t>
+              <w:rPr>
+                <w:rFonts w:ascii="Consolas" w:hAnsi="Consolas"/>
+                <w:sz w:val="20"/>
+              </w:rPr>
+              <w:t>ЭКО</w:t>
+            </w:r>
+            <w:r>
+              <w:t xml:space="preserve"> (уточнено пользователем)</w:t>
             </w:r>
           </w:p>
         </w:tc>
@@ -1939,7 +2051,14 @@
           </w:tcPr>
           <w:p>
             <w:r>
-              <w:t>Агент/скоуп не видны на скриншоте</w:t>
+              <w:rPr>
+                <w:rFonts w:ascii="Consolas" w:hAnsi="Consolas"/>
+                <w:sz w:val="20"/>
+              </w:rPr>
+              <w:t>ЭКО</w:t>
+            </w:r>
+            <w:r>
+              <w:t xml:space="preserve"> (уточнено пользователем)</w:t>
             </w:r>
           </w:p>
         </w:tc>
@@ -1991,7 +2110,14 @@
           </w:tcPr>
           <w:p>
             <w:r>
-              <w:t>Агент/скоуп не видны на скриншоте</w:t>
+              <w:rPr>
+                <w:rFonts w:ascii="Consolas" w:hAnsi="Consolas"/>
+                <w:sz w:val="20"/>
+              </w:rPr>
+              <w:t>ЭКО</w:t>
+            </w:r>
+            <w:r>
+              <w:t xml:space="preserve"> (уточнено пользователем)</w:t>
             </w:r>
           </w:p>
         </w:tc>
@@ -2140,7 +2266,14 @@
           </w:tcPr>
           <w:p>
             <w:r>
-              <w:t>Агент/скоуп не видны на скриншоте</w:t>
+              <w:rPr>
+                <w:rFonts w:ascii="Consolas" w:hAnsi="Consolas"/>
+                <w:sz w:val="20"/>
+              </w:rPr>
+              <w:t>ЭКО</w:t>
+            </w:r>
+            <w:r>
+              <w:t xml:space="preserve"> (уточнено пользователем)</w:t>
             </w:r>
           </w:p>
         </w:tc>
@@ -2270,7 +2403,14 @@
           </w:tcPr>
           <w:p>
             <w:r>
-              <w:t>Агент/скоуп не видны на скриншоте</w:t>
+              <w:rPr>
+                <w:rFonts w:ascii="Consolas" w:hAnsi="Consolas"/>
+                <w:sz w:val="20"/>
+              </w:rPr>
+              <w:t>ЭКО</w:t>
+            </w:r>
+            <w:r>
+              <w:t xml:space="preserve"> (уточнено пользователем)</w:t>
             </w:r>
           </w:p>
         </w:tc>
@@ -2380,7 +2520,14 @@
           </w:tcPr>
           <w:p>
             <w:r>
-              <w:t>Агент/скоуп не видны на скриншоте</w:t>
+              <w:rPr>
+                <w:rFonts w:ascii="Consolas" w:hAnsi="Consolas"/>
+                <w:sz w:val="20"/>
+              </w:rPr>
+              <w:t>ЭКО</w:t>
+            </w:r>
+            <w:r>
+              <w:t xml:space="preserve"> (уточнено пользователем)</w:t>
             </w:r>
           </w:p>
         </w:tc>
@@ -2466,7 +2613,14 @@
           </w:tcPr>
           <w:p>
             <w:r>
-              <w:t>Агент/скоуп не видны на скриншоте</w:t>
+              <w:rPr>
+                <w:rFonts w:ascii="Consolas" w:hAnsi="Consolas"/>
+                <w:sz w:val="20"/>
+              </w:rPr>
+              <w:t>ЭКО</w:t>
+            </w:r>
+            <w:r>
+              <w:t xml:space="preserve"> (уточнено пользователем)</w:t>
             </w:r>
           </w:p>
         </w:tc>
@@ -2577,7 +2731,14 @@
           </w:tcPr>
           <w:p>
             <w:r>
-              <w:t>Агент/скоуп не видны на скриншоте</w:t>
+              <w:rPr>
+                <w:rFonts w:ascii="Consolas" w:hAnsi="Consolas"/>
+                <w:sz w:val="20"/>
+              </w:rPr>
+              <w:t>ЭКО</w:t>
+            </w:r>
+            <w:r>
+              <w:t xml:space="preserve"> (уточнено пользователем)</w:t>
             </w:r>
           </w:p>
         </w:tc>
@@ -2691,7 +2852,14 @@
           </w:tcPr>
           <w:p>
             <w:r>
-              <w:t>Агент/скоуп не видны на скриншоте</w:t>
+              <w:rPr>
+                <w:rFonts w:ascii="Consolas" w:hAnsi="Consolas"/>
+                <w:sz w:val="20"/>
+              </w:rPr>
+              <w:t>ЭКО</w:t>
+            </w:r>
+            <w:r>
+              <w:t xml:space="preserve"> (уточнено пользователем)</w:t>
             </w:r>
           </w:p>
         </w:tc>
@@ -2745,16 +2913,26 @@
           </w:tcPr>
           <w:p>
             <w:r>
-              <w:t xml:space="preserve">Чисто по карточке, но </w:t>
+              <w:t xml:space="preserve">Чисто по карточке. Пользователь подтвердил: тест сегодня идёт на коллекции </w:t>
             </w:r>
             <w:r>
               <w:rPr>
                 <w:b/>
               </w:rPr>
-              <w:t>иной результат, чем ожидался по Находке 3</w:t>
-            </w:r>
-            <w:r>
-              <w:t xml:space="preserve">: там прямой ответ давал именно переконвертированный файл </w:t>
+              <w:t>`ЭКО`</w:t>
+            </w:r>
+            <w:r>
+              <w:t xml:space="preserve"> (не </w:t>
+            </w:r>
+            <w:r>
+              <w:rPr>
+                <w:rFonts w:ascii="Consolas" w:hAnsi="Consolas"/>
+                <w:sz w:val="20"/>
+              </w:rPr>
+              <w:t>ЭКО_2</w:t>
+            </w:r>
+            <w:r>
+              <w:t xml:space="preserve">) — этим объясняется иной результат по сравнению с Находкой 3, где верный прямой ответ давал именно переконвертированный файл </w:t>
             </w:r>
             <w:r>
               <w:rPr>
@@ -2764,7 +2942,7 @@
               <w:t>instrukciya-08-05-08.docx</w:t>
             </w:r>
             <w:r>
-              <w:t xml:space="preserve"> на </w:t>
+              <w:t xml:space="preserve">, загруженный в </w:t>
             </w:r>
             <w:r>
               <w:rPr>
@@ -2774,17 +2952,116 @@
               <w:t>ЭКО_2</w:t>
             </w:r>
             <w:r>
-              <w:t xml:space="preserve">; здесь ссылается на другой документ (Д-08-03-01) и честно не находит порядка самостоятельного добавления — возможно, тест идёт не на </w:t>
+              <w:t xml:space="preserve">. На исходной </w:t>
             </w:r>
             <w:r>
               <w:rPr>
                 <w:rFonts w:ascii="Consolas" w:hAnsi="Consolas"/>
                 <w:sz w:val="20"/>
               </w:rPr>
-              <w:t>ЭКО_2</w:t>
-            </w:r>
-            <w:r>
-              <w:t>, скоуп не зафиксирован</w:t>
+              <w:t>ЭКО</w:t>
+            </w:r>
+            <w:r>
+              <w:t xml:space="preserve"> этого файла нет, поэтому ответ и ссылается на другой документ — не новая аномалия, а ожидаемое следствие выбора коллекции</w:t>
+            </w:r>
+          </w:p>
+        </w:tc>
+      </w:tr>
+      <w:tr>
+        <w:tc>
+          <w:tcPr>
+            <w:tcW w:type="dxa" w:w="1728"/>
+          </w:tcPr>
+          <w:p>
+            <w:r>
+              <w:t>21:30</w:t>
+            </w:r>
+          </w:p>
+        </w:tc>
+        <w:tc>
+          <w:tcPr>
+            <w:tcW w:type="dxa" w:w="1728"/>
+          </w:tcPr>
+          <w:p>
+            <w:r>
+              <w:t>Новый вопрос («Опиши процесс входного контроля сырья.»)</w:t>
+            </w:r>
+          </w:p>
+        </w:tc>
+        <w:tc>
+          <w:tcPr>
+            <w:tcW w:type="dxa" w:w="1728"/>
+          </w:tcPr>
+          <w:p>
+            <w:r>
+              <w:rPr>
+                <w:rFonts w:ascii="Consolas" w:hAnsi="Consolas"/>
+                <w:sz w:val="20"/>
+              </w:rPr>
+              <w:t>ЭКО</w:t>
+            </w:r>
+            <w:r>
+              <w:t xml:space="preserve"> (уточнено пользователем)</w:t>
+            </w:r>
+          </w:p>
+        </w:tc>
+        <w:tc>
+          <w:tcPr>
+            <w:tcW w:type="dxa" w:w="1728"/>
+          </w:tcPr>
+          <w:p>
+            <w:r>
+              <w:t xml:space="preserve">Подробный ответ (6 пунктов): сырьё предъявляют для контроля на складе сырья СО или в ОКК; контроль в рамках ПР-09-00 «Контроль качества»; результаты — журнал «Контроль сырья и индивидуальной упаковки» (Форма 09-01); при несоответствии решение — руководитель ОКК/директор по качеству; при необходимости — акты 03-01/03-02/03-04 и журнал «Учёт несоответствий продукции, сырья, тары»; отмечено, что подробные операции отбора проб и перечень показателей в фрагменте не приведены. Источник в тексте — </w:t>
+            </w:r>
+            <w:r>
+              <w:rPr>
+                <w:b/>
+              </w:rPr>
+              <w:t>ПР-03-00-12</w:t>
+            </w:r>
+            <w:r>
+              <w:t xml:space="preserve"> «Несоответствующая продукция», таблица № 1. Карточки: 1) </w:t>
+            </w:r>
+            <w:r>
+              <w:rPr>
+                <w:b/>
+              </w:rPr>
+              <w:t>глоссарий, 100%</w:t>
+            </w:r>
+            <w:r>
+              <w:t xml:space="preserve">; 2) </w:t>
+            </w:r>
+            <w:r>
+              <w:rPr>
+                <w:rFonts w:ascii="Consolas" w:hAnsi="Consolas"/>
+                <w:sz w:val="20"/>
+              </w:rPr>
+              <w:t>для теста ИИ (1)/ПР-03-00-12 Несоответствующая продукция.doc</w:t>
+            </w:r>
+            <w:r>
+              <w:t xml:space="preserve">, </w:t>
+            </w:r>
+            <w:r>
+              <w:rPr>
+                <w:b/>
+              </w:rPr>
+              <w:t>0%</w:t>
+            </w:r>
+          </w:p>
+        </w:tc>
+        <w:tc>
+          <w:tcPr>
+            <w:tcW w:type="dxa" w:w="1728"/>
+          </w:tcPr>
+          <w:p>
+            <w:r>
+              <w:rPr>
+                <w:b/>
+              </w:rPr>
+              <w:t>Не исправлено — «глоссарий» вернулся, уже не только на вопросе 2.3.</w:t>
+            </w:r>
+            <w:r>
+              <w:t xml:space="preserve"> Шестое наблюдение карточки «глоссарий»/100% за весь тест (было 4 раза на 2.3, теперь ещё раз здесь, на новом вопросе про входной контроль сырья) — и снова в паре с правильным документом на 2-м месте с 0%</w:t>
             </w:r>
           </w:p>
         </w:tc>
@@ -2992,7 +3269,11 @@
           </w:tcPr>
           <w:p>
             <w:r>
-              <w:t>Не зафиксирована на скриншоте</w:t>
+              <w:rPr>
+                <w:rFonts w:ascii="Consolas" w:hAnsi="Consolas"/>
+                <w:sz w:val="20"/>
+              </w:rPr>
+              <w:t>ЭКО</w:t>
             </w:r>
           </w:p>
         </w:tc>
@@ -3044,7 +3325,11 @@
           </w:tcPr>
           <w:p>
             <w:r>
-              <w:t>Не зафиксирована на скриншоте</w:t>
+              <w:rPr>
+                <w:rFonts w:ascii="Consolas" w:hAnsi="Consolas"/>
+                <w:sz w:val="20"/>
+              </w:rPr>
+              <w:t>ЭКО</w:t>
             </w:r>
           </w:p>
         </w:tc>
@@ -3114,7 +3399,11 @@
           </w:tcPr>
           <w:p>
             <w:r>
-              <w:t>Не зафиксирована на скриншоте</w:t>
+              <w:rPr>
+                <w:rFonts w:ascii="Consolas" w:hAnsi="Consolas"/>
+                <w:sz w:val="20"/>
+              </w:rPr>
+              <w:t>ЭКО</w:t>
             </w:r>
           </w:p>
         </w:tc>
@@ -3166,7 +3455,11 @@
           </w:tcPr>
           <w:p>
             <w:r>
-              <w:t>Не зафиксирована на скриншоте</w:t>
+              <w:rPr>
+                <w:rFonts w:ascii="Consolas" w:hAnsi="Consolas"/>
+                <w:sz w:val="20"/>
+              </w:rPr>
+              <w:t>ЭКО</w:t>
             </w:r>
           </w:p>
         </w:tc>
@@ -3218,7 +3511,11 @@
           </w:tcPr>
           <w:p>
             <w:r>
-              <w:t>Не зафиксирована на скриншоте</w:t>
+              <w:rPr>
+                <w:rFonts w:ascii="Consolas" w:hAnsi="Consolas"/>
+                <w:sz w:val="20"/>
+              </w:rPr>
+              <w:t>ЭКО</w:t>
             </w:r>
           </w:p>
         </w:tc>
@@ -3279,7 +3576,11 @@
           </w:tcPr>
           <w:p>
             <w:r>
-              <w:t>Не зафиксирована на скриншоте</w:t>
+              <w:rPr>
+                <w:rFonts w:ascii="Consolas" w:hAnsi="Consolas"/>
+                <w:sz w:val="20"/>
+              </w:rPr>
+              <w:t>ЭКО</w:t>
             </w:r>
           </w:p>
         </w:tc>
@@ -3331,7 +3632,11 @@
           </w:tcPr>
           <w:p>
             <w:r>
-              <w:t>Не зафиксирована на скриншоте</w:t>
+              <w:rPr>
+                <w:rFonts w:ascii="Consolas" w:hAnsi="Consolas"/>
+                <w:sz w:val="20"/>
+              </w:rPr>
+              <w:t>ЭКО</w:t>
             </w:r>
           </w:p>
         </w:tc>
@@ -3383,7 +3688,11 @@
           </w:tcPr>
           <w:p>
             <w:r>
-              <w:t>Не зафиксирована на скриншоте</w:t>
+              <w:rPr>
+                <w:rFonts w:ascii="Consolas" w:hAnsi="Consolas"/>
+                <w:sz w:val="20"/>
+              </w:rPr>
+              <w:t>ЭКО</w:t>
             </w:r>
           </w:p>
         </w:tc>
@@ -3445,7 +3754,11 @@
           </w:tcPr>
           <w:p>
             <w:r>
-              <w:t>Не зафиксирована на скриншоте</w:t>
+              <w:rPr>
+                <w:rFonts w:ascii="Consolas" w:hAnsi="Consolas"/>
+                <w:sz w:val="20"/>
+              </w:rPr>
+              <w:t>ЭКО</w:t>
             </w:r>
           </w:p>
         </w:tc>
@@ -3497,7 +3810,11 @@
           </w:tcPr>
           <w:p>
             <w:r>
-              <w:t>Не зафиксирована на скриншоте</w:t>
+              <w:rPr>
+                <w:rFonts w:ascii="Consolas" w:hAnsi="Consolas"/>
+                <w:sz w:val="20"/>
+              </w:rPr>
+              <w:t>ЭКО</w:t>
             </w:r>
           </w:p>
         </w:tc>
@@ -3549,7 +3866,11 @@
           </w:tcPr>
           <w:p>
             <w:r>
-              <w:t>Не зафиксирована на скриншоте</w:t>
+              <w:rPr>
+                <w:rFonts w:ascii="Consolas" w:hAnsi="Consolas"/>
+                <w:sz w:val="20"/>
+              </w:rPr>
+              <w:t>ЭКО</w:t>
             </w:r>
           </w:p>
         </w:tc>
@@ -3601,7 +3922,11 @@
           </w:tcPr>
           <w:p>
             <w:r>
-              <w:t>Не зафиксирована на скриншоте</w:t>
+              <w:rPr>
+                <w:rFonts w:ascii="Consolas" w:hAnsi="Consolas"/>
+                <w:sz w:val="20"/>
+              </w:rPr>
+              <w:t>ЭКО</w:t>
             </w:r>
           </w:p>
         </w:tc>
@@ -3653,7 +3978,11 @@
           </w:tcPr>
           <w:p>
             <w:r>
-              <w:t>Не зафиксирована на скриншоте</w:t>
+              <w:rPr>
+                <w:rFonts w:ascii="Consolas" w:hAnsi="Consolas"/>
+                <w:sz w:val="20"/>
+              </w:rPr>
+              <w:t>ЭКО</w:t>
             </w:r>
           </w:p>
         </w:tc>
@@ -3705,7 +4034,11 @@
           </w:tcPr>
           <w:p>
             <w:r>
-              <w:t>Не зафиксирована на скриншоте</w:t>
+              <w:rPr>
+                <w:rFonts w:ascii="Consolas" w:hAnsi="Consolas"/>
+                <w:sz w:val="20"/>
+              </w:rPr>
+              <w:t>ЭКО</w:t>
             </w:r>
           </w:p>
         </w:tc>
@@ -3757,7 +4090,11 @@
           </w:tcPr>
           <w:p>
             <w:r>
-              <w:t>Не зафиксирована на скриншоте</w:t>
+              <w:rPr>
+                <w:rFonts w:ascii="Consolas" w:hAnsi="Consolas"/>
+                <w:sz w:val="20"/>
+              </w:rPr>
+              <w:t>ЭКО</w:t>
             </w:r>
           </w:p>
         </w:tc>
@@ -3809,7 +4146,11 @@
           </w:tcPr>
           <w:p>
             <w:r>
-              <w:t>Не зафиксирована на скриншоте</w:t>
+              <w:rPr>
+                <w:rFonts w:ascii="Consolas" w:hAnsi="Consolas"/>
+                <w:sz w:val="20"/>
+              </w:rPr>
+              <w:t>ЭКО</w:t>
             </w:r>
           </w:p>
         </w:tc>
@@ -3861,7 +4202,11 @@
           </w:tcPr>
           <w:p>
             <w:r>
-              <w:t>Не зафиксирована на скриншоте</w:t>
+              <w:rPr>
+                <w:rFonts w:ascii="Consolas" w:hAnsi="Consolas"/>
+                <w:sz w:val="20"/>
+              </w:rPr>
+              <w:t>ЭКО</w:t>
             </w:r>
           </w:p>
         </w:tc>
@@ -3913,7 +4258,11 @@
           </w:tcPr>
           <w:p>
             <w:r>
-              <w:t>Не зафиксирована на скриншоте</w:t>
+              <w:rPr>
+                <w:rFonts w:ascii="Consolas" w:hAnsi="Consolas"/>
+                <w:sz w:val="20"/>
+              </w:rPr>
+              <w:t>ЭКО</w:t>
             </w:r>
           </w:p>
         </w:tc>
@@ -3965,7 +4314,11 @@
           </w:tcPr>
           <w:p>
             <w:r>
-              <w:t>Не зафиксирована на скриншоте</w:t>
+              <w:rPr>
+                <w:rFonts w:ascii="Consolas" w:hAnsi="Consolas"/>
+                <w:sz w:val="20"/>
+              </w:rPr>
+              <w:t>ЭКО</w:t>
             </w:r>
           </w:p>
         </w:tc>
@@ -4017,7 +4370,11 @@
           </w:tcPr>
           <w:p>
             <w:r>
-              <w:t>Не зафиксирована на скриншоте</w:t>
+              <w:rPr>
+                <w:rFonts w:ascii="Consolas" w:hAnsi="Consolas"/>
+                <w:sz w:val="20"/>
+              </w:rPr>
+              <w:t>ЭКО</w:t>
             </w:r>
           </w:p>
         </w:tc>
@@ -4069,7 +4426,11 @@
           </w:tcPr>
           <w:p>
             <w:r>
-              <w:t>Не зафиксирована на скриншоте</w:t>
+              <w:rPr>
+                <w:rFonts w:ascii="Consolas" w:hAnsi="Consolas"/>
+                <w:sz w:val="20"/>
+              </w:rPr>
+              <w:t>ЭКО</w:t>
             </w:r>
           </w:p>
         </w:tc>
@@ -4121,7 +4482,11 @@
           </w:tcPr>
           <w:p>
             <w:r>
-              <w:t>Не зафиксирована на скриншоте</w:t>
+              <w:rPr>
+                <w:rFonts w:ascii="Consolas" w:hAnsi="Consolas"/>
+                <w:sz w:val="20"/>
+              </w:rPr>
+              <w:t>ЭКО</w:t>
             </w:r>
           </w:p>
         </w:tc>
@@ -4173,7 +4538,11 @@
           </w:tcPr>
           <w:p>
             <w:r>
-              <w:t>Не зафиксирована на скриншоте</w:t>
+              <w:rPr>
+                <w:rFonts w:ascii="Consolas" w:hAnsi="Consolas"/>
+                <w:sz w:val="20"/>
+              </w:rPr>
+              <w:t>ЭКО</w:t>
             </w:r>
           </w:p>
         </w:tc>
@@ -4225,7 +4594,67 @@
           </w:tcPr>
           <w:p>
             <w:r>
-              <w:t>Не зафиксирована на скриншоте</w:t>
+              <w:rPr>
+                <w:rFonts w:ascii="Consolas" w:hAnsi="Consolas"/>
+                <w:sz w:val="20"/>
+              </w:rPr>
+              <w:t>ЭКО</w:t>
+            </w:r>
+          </w:p>
+        </w:tc>
+      </w:tr>
+      <w:tr>
+        <w:tc>
+          <w:tcPr>
+            <w:tcW w:type="dxa" w:w="1728"/>
+          </w:tcPr>
+          <w:p>
+            <w:r>
+              <w:t>26</w:t>
+            </w:r>
+          </w:p>
+        </w:tc>
+        <w:tc>
+          <w:tcPr>
+            <w:tcW w:type="dxa" w:w="1728"/>
+          </w:tcPr>
+          <w:p>
+            <w:r>
+              <w:t>21:30</w:t>
+            </w:r>
+          </w:p>
+        </w:tc>
+        <w:tc>
+          <w:tcPr>
+            <w:tcW w:type="dxa" w:w="1728"/>
+          </w:tcPr>
+          <w:p>
+            <w:r>
+              <w:t>Опиши процесс входного контроля сырья.</w:t>
+            </w:r>
+          </w:p>
+        </w:tc>
+        <w:tc>
+          <w:tcPr>
+            <w:tcW w:type="dxa" w:w="1728"/>
+          </w:tcPr>
+          <w:p>
+            <w:r>
+              <w:t>Сырьё предъявляют для контроля на складе сырья СО или в ОКК; контроль в рамках ПР-09-00 «Контроль качества»; результаты — журнал «Контроль сырья и индивидуальной упаковки» (Форма 09-01); при несоответствии решение принимает руководитель ОКК/директор по качеству, он же — решение о дальнейшем применении и корректирующих действиях; при необходимости оформляются «Акт забраковки ТМЦ» (форма 03-01), «Акт разрешения на отклонение» (форма 03-02), «Акт на утилизацию» (форма 03-04), запись в журнале «Учёт несоответствий продукции, сырья, тары» (форма 03-03). Подробные операции отбора проб и перечень показателей в фрагменте не приведены. Источник: ПР-03-00-12 «Несоответствующая продукция», таблица № 1.</w:t>
+            </w:r>
+          </w:p>
+        </w:tc>
+        <w:tc>
+          <w:tcPr>
+            <w:tcW w:type="dxa" w:w="1728"/>
+          </w:tcPr>
+          <w:p>
+            <w:r>
+              <w:rPr>
+                <w:rFonts w:ascii="Consolas" w:hAnsi="Consolas"/>
+                <w:sz w:val="20"/>
+              </w:rPr>
+              <w:t>ЭКО</w:t>
             </w:r>
           </w:p>
         </w:tc>

</xml_diff>

<commit_message>
Note: Находка 1 (agent Аналитик) verification skipped this session per user decision
Co-Authored-By: Claude Sonnet 5 <noreply@anthropic.com>
Claude-Session: https://claude.ai/code/session_01DpSN8JwCJ3tg3JVUadr2zE
</commit_message>
<xml_diff>
--- a/docs/accounts/eco/pilot-test-04-fix-verification.docx
+++ b/docs/accounts/eco/pilot-test-04-fix-verification.docx
@@ -248,6 +248,37 @@
     <w:p>
       <w:r>
         <w:t>Приоритет — Находка 2 (вопрос 2.3), это самый надёжно воспроизводимый кейс из всех вчерашних, наиболее чистый тест «починили или нет».</w:t>
+      </w:r>
+    </w:p>
+    <w:p>
+      <w:r>
+        <w:rPr>
+          <w:b/>
+        </w:rPr>
+        <w:t>Находка 1 (агент «Аналитик») в этой сессии не проверялась</w:t>
+      </w:r>
+      <w:r>
+        <w:t xml:space="preserve"> — решение пользователя пропустить эту проверку сегодня. Остаётся открытым пунктом на будущее: нужен вопрос, заданный агентом «Аналитик», со скриншотом «Где искать» при переключении </w:t>
+      </w:r>
+      <w:r>
+        <w:rPr>
+          <w:rFonts w:ascii="Consolas" w:hAnsi="Consolas"/>
+          <w:sz w:val="20"/>
+        </w:rPr>
+        <w:t>ЭКО_2</w:t>
+      </w:r>
+      <w:r>
+        <w:t>↔</w:t>
+      </w:r>
+      <w:r>
+        <w:rPr>
+          <w:rFonts w:ascii="Consolas" w:hAnsi="Consolas"/>
+          <w:sz w:val="20"/>
+        </w:rPr>
+        <w:t>ЭКО</w:t>
+      </w:r>
+      <w:r>
+        <w:t>.</w:t>
       </w:r>
     </w:p>
     <w:p>

</xml_diff>

<commit_message>
Fix scope: 21:07 (2.3 retry after F5) was actually on ЭКО_2, not ЭКО
Co-Authored-By: Claude Sonnet 5 <noreply@anthropic.com>
Claude-Session: https://claude.ai/code/session_01DpSN8JwCJ3tg3JVUadr2zE
</commit_message>
<xml_diff>
--- a/docs/accounts/eco/pilot-test-04-fix-verification.docx
+++ b/docs/accounts/eco/pilot-test-04-fix-verification.docx
@@ -998,13 +998,32 @@
           <w:p>
             <w:r>
               <w:rPr>
+                <w:b/>
+              </w:rPr>
+              <w:t>`ЭКО_2`</w:t>
+            </w:r>
+            <w:r>
+              <w:t xml:space="preserve"> (уточнено пользователем — здесь была выбрана именно </w:t>
+            </w:r>
+            <w:r>
+              <w:rPr>
+                <w:rFonts w:ascii="Consolas" w:hAnsi="Consolas"/>
+                <w:sz w:val="20"/>
+              </w:rPr>
+              <w:t>ЭКО_2</w:t>
+            </w:r>
+            <w:r>
+              <w:t xml:space="preserve">, а не </w:t>
+            </w:r>
+            <w:r>
+              <w:rPr>
                 <w:rFonts w:ascii="Consolas" w:hAnsi="Consolas"/>
                 <w:sz w:val="20"/>
               </w:rPr>
               <w:t>ЭКО</w:t>
             </w:r>
             <w:r>
-              <w:t xml:space="preserve"> (уточнено пользователем)</w:t>
+              <w:t>)</w:t>
             </w:r>
           </w:p>
         </w:tc>
@@ -3608,10 +3627,9 @@
           <w:p>
             <w:r>
               <w:rPr>
-                <w:rFonts w:ascii="Consolas" w:hAnsi="Consolas"/>
-                <w:sz w:val="20"/>
+                <w:b/>
               </w:rPr>
-              <w:t>ЭКО</w:t>
+              <w:t>`ЭКО_2`</w:t>
             </w:r>
           </w:p>
         </w:tc>

</xml_diff>

<commit_message>
Correct collection scope: rows 21:09-21:30 were on ЭКО_2, not ЭКО
User confirmed it switched back to ЭКО_2 after the 21:07 F5 retry and stayed there through 21:30. This flips the interpretation of the 6.2 (21:29) result: since ЭКО_2 already has the reconverted instrukciya-08-05-08.docx that gave a correct direct answer per Находка 3, today's retrieval choosing a different, less complete document is a regression, not an expected collection-mismatch artifact.

Co-Authored-By: Claude Sonnet 5 <noreply@anthropic.com>
Claude-Session: https://claude.ai/code/session_01DpSN8JwCJ3tg3JVUadr2zE
</commit_message>
<xml_diff>
--- a/docs/accounts/eco/pilot-test-04-fix-verification.docx
+++ b/docs/accounts/eco/pilot-test-04-fix-verification.docx
@@ -1147,10 +1147,20 @@
                 <w:rFonts w:ascii="Consolas" w:hAnsi="Consolas"/>
                 <w:sz w:val="20"/>
               </w:rPr>
-              <w:t>ЭКО</w:t>
-            </w:r>
-            <w:r>
-              <w:t xml:space="preserve"> (уточнено пользователем)</w:t>
+              <w:t>ЭКО_2</w:t>
+            </w:r>
+            <w:r>
+              <w:t xml:space="preserve"> (уточнено пользователем — переключились обратно на </w:t>
+            </w:r>
+            <w:r>
+              <w:rPr>
+                <w:rFonts w:ascii="Consolas" w:hAnsi="Consolas"/>
+                <w:sz w:val="20"/>
+              </w:rPr>
+              <w:t>ЭКО_2</w:t>
+            </w:r>
+            <w:r>
+              <w:t xml:space="preserve"> после 21:07)</w:t>
             </w:r>
           </w:p>
         </w:tc>
@@ -1231,10 +1241,20 @@
                 <w:rFonts w:ascii="Consolas" w:hAnsi="Consolas"/>
                 <w:sz w:val="20"/>
               </w:rPr>
-              <w:t>ЭКО</w:t>
-            </w:r>
-            <w:r>
-              <w:t xml:space="preserve"> (уточнено пользователем)</w:t>
+              <w:t>ЭКО_2</w:t>
+            </w:r>
+            <w:r>
+              <w:t xml:space="preserve"> (уточнено пользователем — переключились обратно на </w:t>
+            </w:r>
+            <w:r>
+              <w:rPr>
+                <w:rFonts w:ascii="Consolas" w:hAnsi="Consolas"/>
+                <w:sz w:val="20"/>
+              </w:rPr>
+              <w:t>ЭКО_2</w:t>
+            </w:r>
+            <w:r>
+              <w:t xml:space="preserve"> после 21:07)</w:t>
             </w:r>
           </w:p>
         </w:tc>
@@ -1314,10 +1334,20 @@
                 <w:rFonts w:ascii="Consolas" w:hAnsi="Consolas"/>
                 <w:sz w:val="20"/>
               </w:rPr>
-              <w:t>ЭКО</w:t>
-            </w:r>
-            <w:r>
-              <w:t xml:space="preserve"> (уточнено пользователем)</w:t>
+              <w:t>ЭКО_2</w:t>
+            </w:r>
+            <w:r>
+              <w:t xml:space="preserve"> (уточнено пользователем — переключились обратно на </w:t>
+            </w:r>
+            <w:r>
+              <w:rPr>
+                <w:rFonts w:ascii="Consolas" w:hAnsi="Consolas"/>
+                <w:sz w:val="20"/>
+              </w:rPr>
+              <w:t>ЭКО_2</w:t>
+            </w:r>
+            <w:r>
+              <w:t xml:space="preserve"> после 21:07)</w:t>
             </w:r>
           </w:p>
         </w:tc>
@@ -1435,10 +1465,20 @@
                 <w:rFonts w:ascii="Consolas" w:hAnsi="Consolas"/>
                 <w:sz w:val="20"/>
               </w:rPr>
-              <w:t>ЭКО</w:t>
-            </w:r>
-            <w:r>
-              <w:t xml:space="preserve"> (уточнено пользователем)</w:t>
+              <w:t>ЭКО_2</w:t>
+            </w:r>
+            <w:r>
+              <w:t xml:space="preserve"> (уточнено пользователем — переключились обратно на </w:t>
+            </w:r>
+            <w:r>
+              <w:rPr>
+                <w:rFonts w:ascii="Consolas" w:hAnsi="Consolas"/>
+                <w:sz w:val="20"/>
+              </w:rPr>
+              <w:t>ЭКО_2</w:t>
+            </w:r>
+            <w:r>
+              <w:t xml:space="preserve"> после 21:07)</w:t>
             </w:r>
           </w:p>
         </w:tc>
@@ -1553,10 +1593,20 @@
                 <w:rFonts w:ascii="Consolas" w:hAnsi="Consolas"/>
                 <w:sz w:val="20"/>
               </w:rPr>
-              <w:t>ЭКО</w:t>
-            </w:r>
-            <w:r>
-              <w:t xml:space="preserve"> (уточнено пользователем)</w:t>
+              <w:t>ЭКО_2</w:t>
+            </w:r>
+            <w:r>
+              <w:t xml:space="preserve"> (уточнено пользователем — переключились обратно на </w:t>
+            </w:r>
+            <w:r>
+              <w:rPr>
+                <w:rFonts w:ascii="Consolas" w:hAnsi="Consolas"/>
+                <w:sz w:val="20"/>
+              </w:rPr>
+              <w:t>ЭКО_2</w:t>
+            </w:r>
+            <w:r>
+              <w:t xml:space="preserve"> после 21:07)</w:t>
             </w:r>
           </w:p>
         </w:tc>
@@ -1637,10 +1687,20 @@
                 <w:rFonts w:ascii="Consolas" w:hAnsi="Consolas"/>
                 <w:sz w:val="20"/>
               </w:rPr>
-              <w:t>ЭКО</w:t>
-            </w:r>
-            <w:r>
-              <w:t xml:space="preserve"> (уточнено пользователем)</w:t>
+              <w:t>ЭКО_2</w:t>
+            </w:r>
+            <w:r>
+              <w:t xml:space="preserve"> (уточнено пользователем — переключились обратно на </w:t>
+            </w:r>
+            <w:r>
+              <w:rPr>
+                <w:rFonts w:ascii="Consolas" w:hAnsi="Consolas"/>
+                <w:sz w:val="20"/>
+              </w:rPr>
+              <w:t>ЭКО_2</w:t>
+            </w:r>
+            <w:r>
+              <w:t xml:space="preserve"> после 21:07)</w:t>
             </w:r>
           </w:p>
         </w:tc>
@@ -1721,10 +1781,20 @@
                 <w:rFonts w:ascii="Consolas" w:hAnsi="Consolas"/>
                 <w:sz w:val="20"/>
               </w:rPr>
-              <w:t>ЭКО</w:t>
-            </w:r>
-            <w:r>
-              <w:t xml:space="preserve"> (уточнено пользователем)</w:t>
+              <w:t>ЭКО_2</w:t>
+            </w:r>
+            <w:r>
+              <w:t xml:space="preserve"> (уточнено пользователем — переключились обратно на </w:t>
+            </w:r>
+            <w:r>
+              <w:rPr>
+                <w:rFonts w:ascii="Consolas" w:hAnsi="Consolas"/>
+                <w:sz w:val="20"/>
+              </w:rPr>
+              <w:t>ЭКО_2</w:t>
+            </w:r>
+            <w:r>
+              <w:t xml:space="preserve"> после 21:07)</w:t>
             </w:r>
           </w:p>
         </w:tc>
@@ -1805,10 +1875,20 @@
                 <w:rFonts w:ascii="Consolas" w:hAnsi="Consolas"/>
                 <w:sz w:val="20"/>
               </w:rPr>
-              <w:t>ЭКО</w:t>
-            </w:r>
-            <w:r>
-              <w:t xml:space="preserve"> (уточнено пользователем)</w:t>
+              <w:t>ЭКО_2</w:t>
+            </w:r>
+            <w:r>
+              <w:t xml:space="preserve"> (уточнено пользователем — переключились обратно на </w:t>
+            </w:r>
+            <w:r>
+              <w:rPr>
+                <w:rFonts w:ascii="Consolas" w:hAnsi="Consolas"/>
+                <w:sz w:val="20"/>
+              </w:rPr>
+              <w:t>ЭКО_2</w:t>
+            </w:r>
+            <w:r>
+              <w:t xml:space="preserve"> после 21:07)</w:t>
             </w:r>
           </w:p>
         </w:tc>
@@ -1908,10 +1988,20 @@
                 <w:rFonts w:ascii="Consolas" w:hAnsi="Consolas"/>
                 <w:sz w:val="20"/>
               </w:rPr>
-              <w:t>ЭКО</w:t>
-            </w:r>
-            <w:r>
-              <w:t xml:space="preserve"> (уточнено пользователем)</w:t>
+              <w:t>ЭКО_2</w:t>
+            </w:r>
+            <w:r>
+              <w:t xml:space="preserve"> (уточнено пользователем — переключились обратно на </w:t>
+            </w:r>
+            <w:r>
+              <w:rPr>
+                <w:rFonts w:ascii="Consolas" w:hAnsi="Consolas"/>
+                <w:sz w:val="20"/>
+              </w:rPr>
+              <w:t>ЭКО_2</w:t>
+            </w:r>
+            <w:r>
+              <w:t xml:space="preserve"> после 21:07)</w:t>
             </w:r>
           </w:p>
         </w:tc>
@@ -1977,10 +2067,20 @@
                 <w:rFonts w:ascii="Consolas" w:hAnsi="Consolas"/>
                 <w:sz w:val="20"/>
               </w:rPr>
-              <w:t>ЭКО</w:t>
-            </w:r>
-            <w:r>
-              <w:t xml:space="preserve"> (уточнено пользователем)</w:t>
+              <w:t>ЭКО_2</w:t>
+            </w:r>
+            <w:r>
+              <w:t xml:space="preserve"> (уточнено пользователем — переключились обратно на </w:t>
+            </w:r>
+            <w:r>
+              <w:rPr>
+                <w:rFonts w:ascii="Consolas" w:hAnsi="Consolas"/>
+                <w:sz w:val="20"/>
+              </w:rPr>
+              <w:t>ЭКО_2</w:t>
+            </w:r>
+            <w:r>
+              <w:t xml:space="preserve"> после 21:07)</w:t>
             </w:r>
           </w:p>
         </w:tc>
@@ -2105,10 +2205,20 @@
                 <w:rFonts w:ascii="Consolas" w:hAnsi="Consolas"/>
                 <w:sz w:val="20"/>
               </w:rPr>
-              <w:t>ЭКО</w:t>
-            </w:r>
-            <w:r>
-              <w:t xml:space="preserve"> (уточнено пользователем)</w:t>
+              <w:t>ЭКО_2</w:t>
+            </w:r>
+            <w:r>
+              <w:t xml:space="preserve"> (уточнено пользователем — переключились обратно на </w:t>
+            </w:r>
+            <w:r>
+              <w:rPr>
+                <w:rFonts w:ascii="Consolas" w:hAnsi="Consolas"/>
+                <w:sz w:val="20"/>
+              </w:rPr>
+              <w:t>ЭКО_2</w:t>
+            </w:r>
+            <w:r>
+              <w:t xml:space="preserve"> после 21:07)</w:t>
             </w:r>
           </w:p>
         </w:tc>
@@ -2164,10 +2274,20 @@
                 <w:rFonts w:ascii="Consolas" w:hAnsi="Consolas"/>
                 <w:sz w:val="20"/>
               </w:rPr>
-              <w:t>ЭКО</w:t>
-            </w:r>
-            <w:r>
-              <w:t xml:space="preserve"> (уточнено пользователем)</w:t>
+              <w:t>ЭКО_2</w:t>
+            </w:r>
+            <w:r>
+              <w:t xml:space="preserve"> (уточнено пользователем — переключились обратно на </w:t>
+            </w:r>
+            <w:r>
+              <w:rPr>
+                <w:rFonts w:ascii="Consolas" w:hAnsi="Consolas"/>
+                <w:sz w:val="20"/>
+              </w:rPr>
+              <w:t>ЭКО_2</w:t>
+            </w:r>
+            <w:r>
+              <w:t xml:space="preserve"> после 21:07)</w:t>
             </w:r>
           </w:p>
         </w:tc>
@@ -2320,10 +2440,20 @@
                 <w:rFonts w:ascii="Consolas" w:hAnsi="Consolas"/>
                 <w:sz w:val="20"/>
               </w:rPr>
-              <w:t>ЭКО</w:t>
-            </w:r>
-            <w:r>
-              <w:t xml:space="preserve"> (уточнено пользователем)</w:t>
+              <w:t>ЭКО_2</w:t>
+            </w:r>
+            <w:r>
+              <w:t xml:space="preserve"> (уточнено пользователем — переключились обратно на </w:t>
+            </w:r>
+            <w:r>
+              <w:rPr>
+                <w:rFonts w:ascii="Consolas" w:hAnsi="Consolas"/>
+                <w:sz w:val="20"/>
+              </w:rPr>
+              <w:t>ЭКО_2</w:t>
+            </w:r>
+            <w:r>
+              <w:t xml:space="preserve"> после 21:07)</w:t>
             </w:r>
           </w:p>
         </w:tc>
@@ -2457,10 +2587,20 @@
                 <w:rFonts w:ascii="Consolas" w:hAnsi="Consolas"/>
                 <w:sz w:val="20"/>
               </w:rPr>
-              <w:t>ЭКО</w:t>
-            </w:r>
-            <w:r>
-              <w:t xml:space="preserve"> (уточнено пользователем)</w:t>
+              <w:t>ЭКО_2</w:t>
+            </w:r>
+            <w:r>
+              <w:t xml:space="preserve"> (уточнено пользователем — переключились обратно на </w:t>
+            </w:r>
+            <w:r>
+              <w:rPr>
+                <w:rFonts w:ascii="Consolas" w:hAnsi="Consolas"/>
+                <w:sz w:val="20"/>
+              </w:rPr>
+              <w:t>ЭКО_2</w:t>
+            </w:r>
+            <w:r>
+              <w:t xml:space="preserve"> после 21:07)</w:t>
             </w:r>
           </w:p>
         </w:tc>
@@ -2574,10 +2714,20 @@
                 <w:rFonts w:ascii="Consolas" w:hAnsi="Consolas"/>
                 <w:sz w:val="20"/>
               </w:rPr>
-              <w:t>ЭКО</w:t>
-            </w:r>
-            <w:r>
-              <w:t xml:space="preserve"> (уточнено пользователем)</w:t>
+              <w:t>ЭКО_2</w:t>
+            </w:r>
+            <w:r>
+              <w:t xml:space="preserve"> (уточнено пользователем — переключились обратно на </w:t>
+            </w:r>
+            <w:r>
+              <w:rPr>
+                <w:rFonts w:ascii="Consolas" w:hAnsi="Consolas"/>
+                <w:sz w:val="20"/>
+              </w:rPr>
+              <w:t>ЭКО_2</w:t>
+            </w:r>
+            <w:r>
+              <w:t xml:space="preserve"> после 21:07)</w:t>
             </w:r>
           </w:p>
         </w:tc>
@@ -2667,10 +2817,20 @@
                 <w:rFonts w:ascii="Consolas" w:hAnsi="Consolas"/>
                 <w:sz w:val="20"/>
               </w:rPr>
-              <w:t>ЭКО</w:t>
-            </w:r>
-            <w:r>
-              <w:t xml:space="preserve"> (уточнено пользователем)</w:t>
+              <w:t>ЭКО_2</w:t>
+            </w:r>
+            <w:r>
+              <w:t xml:space="preserve"> (уточнено пользователем — переключились обратно на </w:t>
+            </w:r>
+            <w:r>
+              <w:rPr>
+                <w:rFonts w:ascii="Consolas" w:hAnsi="Consolas"/>
+                <w:sz w:val="20"/>
+              </w:rPr>
+              <w:t>ЭКО_2</w:t>
+            </w:r>
+            <w:r>
+              <w:t xml:space="preserve"> после 21:07)</w:t>
             </w:r>
           </w:p>
         </w:tc>
@@ -2785,10 +2945,20 @@
                 <w:rFonts w:ascii="Consolas" w:hAnsi="Consolas"/>
                 <w:sz w:val="20"/>
               </w:rPr>
-              <w:t>ЭКО</w:t>
-            </w:r>
-            <w:r>
-              <w:t xml:space="preserve"> (уточнено пользователем)</w:t>
+              <w:t>ЭКО_2</w:t>
+            </w:r>
+            <w:r>
+              <w:t xml:space="preserve"> (уточнено пользователем — переключились обратно на </w:t>
+            </w:r>
+            <w:r>
+              <w:rPr>
+                <w:rFonts w:ascii="Consolas" w:hAnsi="Consolas"/>
+                <w:sz w:val="20"/>
+              </w:rPr>
+              <w:t>ЭКО_2</w:t>
+            </w:r>
+            <w:r>
+              <w:t xml:space="preserve"> после 21:07)</w:t>
             </w:r>
           </w:p>
         </w:tc>
@@ -2906,10 +3076,20 @@
                 <w:rFonts w:ascii="Consolas" w:hAnsi="Consolas"/>
                 <w:sz w:val="20"/>
               </w:rPr>
-              <w:t>ЭКО</w:t>
-            </w:r>
-            <w:r>
-              <w:t xml:space="preserve"> (уточнено пользователем)</w:t>
+              <w:t>ЭКО_2</w:t>
+            </w:r>
+            <w:r>
+              <w:t xml:space="preserve"> (уточнено пользователем — переключились обратно на </w:t>
+            </w:r>
+            <w:r>
+              <w:rPr>
+                <w:rFonts w:ascii="Consolas" w:hAnsi="Consolas"/>
+                <w:sz w:val="20"/>
+              </w:rPr>
+              <w:t>ЭКО_2</w:t>
+            </w:r>
+            <w:r>
+              <w:t xml:space="preserve"> после 21:07)</w:t>
             </w:r>
           </w:p>
         </w:tc>
@@ -2963,16 +3143,16 @@
           </w:tcPr>
           <w:p>
             <w:r>
-              <w:t xml:space="preserve">Чисто по карточке. Пользователь подтвердил: тест сегодня идёт на коллекции </w:t>
+              <w:t xml:space="preserve">Чисто по карточке (Д-08-03-01 совпадает с текстом), но </w:t>
             </w:r>
             <w:r>
               <w:rPr>
                 <w:b/>
               </w:rPr>
-              <w:t>`ЭКО`</w:t>
-            </w:r>
-            <w:r>
-              <w:t xml:space="preserve"> (не </w:t>
+              <w:t>содержательно это неожиданный результат</w:t>
+            </w:r>
+            <w:r>
+              <w:t xml:space="preserve">: коллекция здесь — </w:t>
             </w:r>
             <w:r>
               <w:rPr>
@@ -2982,7 +3162,7 @@
               <w:t>ЭКО_2</w:t>
             </w:r>
             <w:r>
-              <w:t xml:space="preserve">) — этим объясняется иной результат по сравнению с Находкой 3, где верный прямой ответ давал именно переконвертированный файл </w:t>
+              <w:t xml:space="preserve"> (уточнено пользователем), где переконвертированный файл </w:t>
             </w:r>
             <w:r>
               <w:rPr>
@@ -2992,7 +3172,7 @@
               <w:t>instrukciya-08-05-08.docx</w:t>
             </w:r>
             <w:r>
-              <w:t xml:space="preserve">, загруженный в </w:t>
+              <w:t xml:space="preserve"> присутствует и раньше (Находка 3) давал прямой верный ответ на этот же вопрос. Сейчас retrieval вместо него нашёл другой документ (Д-08-03-01) и честно признал, что порядка самостоятельного добавления спецификации не нашёл — то есть на </w:t>
             </w:r>
             <w:r>
               <w:rPr>
@@ -3002,17 +3182,23 @@
               <w:t>ЭКО_2</w:t>
             </w:r>
             <w:r>
-              <w:t xml:space="preserve">. На исходной </w:t>
+              <w:t xml:space="preserve"> результат по 6.2 стал </w:t>
+            </w:r>
+            <w:r>
+              <w:rPr>
+                <w:b/>
+              </w:rPr>
+              <w:t>хуже</w:t>
+            </w:r>
+            <w:r>
+              <w:t xml:space="preserve">, чем при исходной проверке Находки 3, а не лучше. Нужна отдельная перепроверка этого вопроса на </w:t>
             </w:r>
             <w:r>
               <w:rPr>
                 <w:rFonts w:ascii="Consolas" w:hAnsi="Consolas"/>
                 <w:sz w:val="20"/>
               </w:rPr>
-              <w:t>ЭКО</w:t>
-            </w:r>
-            <w:r>
-              <w:t xml:space="preserve"> этого файла нет, поэтому ответ и ссылается на другой документ — не новая аномалия, а ожидаемое следствие выбора коллекции</w:t>
+              <w:t>ЭКО_2</w:t>
             </w:r>
           </w:p>
         </w:tc>
@@ -3048,10 +3234,20 @@
                 <w:rFonts w:ascii="Consolas" w:hAnsi="Consolas"/>
                 <w:sz w:val="20"/>
               </w:rPr>
-              <w:t>ЭКО</w:t>
-            </w:r>
-            <w:r>
-              <w:t xml:space="preserve"> (уточнено пользователем)</w:t>
+              <w:t>ЭКО_2</w:t>
+            </w:r>
+            <w:r>
+              <w:t xml:space="preserve"> (уточнено пользователем — переключились обратно на </w:t>
+            </w:r>
+            <w:r>
+              <w:rPr>
+                <w:rFonts w:ascii="Consolas" w:hAnsi="Consolas"/>
+                <w:sz w:val="20"/>
+              </w:rPr>
+              <w:t>ЭКО_2</w:t>
+            </w:r>
+            <w:r>
+              <w:t xml:space="preserve"> после 21:07)</w:t>
             </w:r>
           </w:p>
         </w:tc>
@@ -3685,7 +3881,7 @@
                 <w:rFonts w:ascii="Consolas" w:hAnsi="Consolas"/>
                 <w:sz w:val="20"/>
               </w:rPr>
-              <w:t>ЭКО</w:t>
+              <w:t>ЭКО_2</w:t>
             </w:r>
           </w:p>
         </w:tc>
@@ -3741,7 +3937,7 @@
                 <w:rFonts w:ascii="Consolas" w:hAnsi="Consolas"/>
                 <w:sz w:val="20"/>
               </w:rPr>
-              <w:t>ЭКО</w:t>
+              <w:t>ЭКО_2</w:t>
             </w:r>
           </w:p>
         </w:tc>
@@ -3807,7 +4003,7 @@
                 <w:rFonts w:ascii="Consolas" w:hAnsi="Consolas"/>
                 <w:sz w:val="20"/>
               </w:rPr>
-              <w:t>ЭКО</w:t>
+              <w:t>ЭКО_2</w:t>
             </w:r>
           </w:p>
         </w:tc>
@@ -3863,7 +4059,7 @@
                 <w:rFonts w:ascii="Consolas" w:hAnsi="Consolas"/>
                 <w:sz w:val="20"/>
               </w:rPr>
-              <w:t>ЭКО</w:t>
+              <w:t>ЭКО_2</w:t>
             </w:r>
           </w:p>
         </w:tc>
@@ -3919,7 +4115,7 @@
                 <w:rFonts w:ascii="Consolas" w:hAnsi="Consolas"/>
                 <w:sz w:val="20"/>
               </w:rPr>
-              <w:t>ЭКО</w:t>
+              <w:t>ЭКО_2</w:t>
             </w:r>
           </w:p>
         </w:tc>
@@ -3975,7 +4171,7 @@
                 <w:rFonts w:ascii="Consolas" w:hAnsi="Consolas"/>
                 <w:sz w:val="20"/>
               </w:rPr>
-              <w:t>ЭКО</w:t>
+              <w:t>ЭКО_2</w:t>
             </w:r>
           </w:p>
         </w:tc>
@@ -4031,7 +4227,7 @@
                 <w:rFonts w:ascii="Consolas" w:hAnsi="Consolas"/>
                 <w:sz w:val="20"/>
               </w:rPr>
-              <w:t>ЭКО</w:t>
+              <w:t>ЭКО_2</w:t>
             </w:r>
           </w:p>
         </w:tc>
@@ -4087,7 +4283,7 @@
                 <w:rFonts w:ascii="Consolas" w:hAnsi="Consolas"/>
                 <w:sz w:val="20"/>
               </w:rPr>
-              <w:t>ЭКО</w:t>
+              <w:t>ЭКО_2</w:t>
             </w:r>
           </w:p>
         </w:tc>
@@ -4143,7 +4339,7 @@
                 <w:rFonts w:ascii="Consolas" w:hAnsi="Consolas"/>
                 <w:sz w:val="20"/>
               </w:rPr>
-              <w:t>ЭКО</w:t>
+              <w:t>ЭКО_2</w:t>
             </w:r>
           </w:p>
         </w:tc>
@@ -4199,7 +4395,7 @@
                 <w:rFonts w:ascii="Consolas" w:hAnsi="Consolas"/>
                 <w:sz w:val="20"/>
               </w:rPr>
-              <w:t>ЭКО</w:t>
+              <w:t>ЭКО_2</w:t>
             </w:r>
           </w:p>
         </w:tc>
@@ -4255,7 +4451,7 @@
                 <w:rFonts w:ascii="Consolas" w:hAnsi="Consolas"/>
                 <w:sz w:val="20"/>
               </w:rPr>
-              <w:t>ЭКО</w:t>
+              <w:t>ЭКО_2</w:t>
             </w:r>
           </w:p>
         </w:tc>
@@ -4311,7 +4507,7 @@
                 <w:rFonts w:ascii="Consolas" w:hAnsi="Consolas"/>
                 <w:sz w:val="20"/>
               </w:rPr>
-              <w:t>ЭКО</w:t>
+              <w:t>ЭКО_2</w:t>
             </w:r>
           </w:p>
         </w:tc>
@@ -4367,7 +4563,7 @@
                 <w:rFonts w:ascii="Consolas" w:hAnsi="Consolas"/>
                 <w:sz w:val="20"/>
               </w:rPr>
-              <w:t>ЭКО</w:t>
+              <w:t>ЭКО_2</w:t>
             </w:r>
           </w:p>
         </w:tc>
@@ -4423,7 +4619,7 @@
                 <w:rFonts w:ascii="Consolas" w:hAnsi="Consolas"/>
                 <w:sz w:val="20"/>
               </w:rPr>
-              <w:t>ЭКО</w:t>
+              <w:t>ЭКО_2</w:t>
             </w:r>
           </w:p>
         </w:tc>
@@ -4479,7 +4675,7 @@
                 <w:rFonts w:ascii="Consolas" w:hAnsi="Consolas"/>
                 <w:sz w:val="20"/>
               </w:rPr>
-              <w:t>ЭКО</w:t>
+              <w:t>ЭКО_2</w:t>
             </w:r>
           </w:p>
         </w:tc>
@@ -4535,7 +4731,7 @@
                 <w:rFonts w:ascii="Consolas" w:hAnsi="Consolas"/>
                 <w:sz w:val="20"/>
               </w:rPr>
-              <w:t>ЭКО</w:t>
+              <w:t>ЭКО_2</w:t>
             </w:r>
           </w:p>
         </w:tc>
@@ -4591,7 +4787,7 @@
                 <w:rFonts w:ascii="Consolas" w:hAnsi="Consolas"/>
                 <w:sz w:val="20"/>
               </w:rPr>
-              <w:t>ЭКО</w:t>
+              <w:t>ЭКО_2</w:t>
             </w:r>
           </w:p>
         </w:tc>
@@ -4647,7 +4843,7 @@
                 <w:rFonts w:ascii="Consolas" w:hAnsi="Consolas"/>
                 <w:sz w:val="20"/>
               </w:rPr>
-              <w:t>ЭКО</w:t>
+              <w:t>ЭКО_2</w:t>
             </w:r>
           </w:p>
         </w:tc>
@@ -4703,7 +4899,7 @@
                 <w:rFonts w:ascii="Consolas" w:hAnsi="Consolas"/>
                 <w:sz w:val="20"/>
               </w:rPr>
-              <w:t>ЭКО</w:t>
+              <w:t>ЭКО_2</w:t>
             </w:r>
           </w:p>
         </w:tc>

</xml_diff>